<commit_message>
Apresenta níveis de retorno GEV com IC bootstrap resumido
</commit_message>
<xml_diff>
--- a/docs/relatorio.docx
+++ b/docs/relatorio.docx
@@ -3736,7 +3736,7 @@
               <w:pStyle w:val="ImageCaption"/>
             </w:pPr>
             <w:r>
-              <w:t xml:space="preserve">Tabela 4: Níveis formais de retorno da GEV mensal e IC percentil nominal de 95% por bootstrap móvel. Níveis e limites em W/m²; não são previsões solares validadas.</w:t>
+              <w:t xml:space="preserve">Tabela 4: Níveis de retorno do fluxo solar XRS-B estimados pela GEV, com intervalos de confiança de 95%.</w:t>
             </w:r>
           </w:p>
           <w:p>
@@ -3745,7 +3745,7 @@
               <w:jc w:val="center"/>
             </w:pPr>
             <w:r>
-              <w:t xml:space="preserve">Níveis formais de retorno da GEV mensal e IC percentil nominal de 95% por bootstrap móvel. Níveis e limites em W/m²; não são previsões solares validadas.</w:t>
+              <w:t xml:space="preserve">Níveis de retorno do fluxo solar XRS-B estimados pela GEV, com intervalos de confiança de 95%.</w:t>
             </w:r>
           </w:p>
           <w:tbl>
@@ -3754,13 +3754,12 @@
               <w:tblW w:type="pct" w:w="5000"/>
               <w:tblLayout w:type="fixed"/>
               <w:tblLook w:firstRow="1" w:lastRow="0" w:firstColumn="0" w:lastColumn="0" w:noHBand="0" w:noVBand="0" w:val="0020"/>
-              <w:tblCaption w:val="Níveis formais de retorno da GEV mensal e IC percentil nominal de 95% por bootstrap móvel. Níveis e limites em W/m²; não são previsões solares validadas."/>
+              <w:tblCaption w:val="Níveis de retorno do fluxo solar XRS-B estimados pela GEV, com intervalos de confiança de 95%."/>
             </w:tblPr>
             <w:tblGrid>
-              <w:gridCol w:w="1760"/>
-              <w:gridCol w:w="1980"/>
-              <w:gridCol w:w="2200"/>
-              <w:gridCol w:w="1980"/>
+              <w:gridCol w:w="1508"/>
+              <w:gridCol w:w="2074"/>
+              <w:gridCol w:w="4337"/>
             </w:tblGrid>
             <w:tr>
               <w:trPr>
@@ -3775,46 +3774,33 @@
                     <w:jc w:val="center"/>
                   </w:pPr>
                   <w:r>
-                    <w:t xml:space="preserve">Período (anos)</w:t>
-                  </w:r>
-                </w:p>
-              </w:tc>
-              <w:tc>
-                <w:tcPr/>
-                <w:p>
-                  <w:pPr>
-                    <w:pStyle w:val="Compact"/>
-                    <w:jc w:val="left"/>
-                    <w:jc w:val="center"/>
-                  </w:pPr>
-                  <w:r>
-                    <w:t xml:space="preserve">Nível (W/m²)</w:t>
-                  </w:r>
-                </w:p>
-              </w:tc>
-              <w:tc>
-                <w:tcPr/>
-                <w:p>
-                  <w:pPr>
-                    <w:pStyle w:val="Compact"/>
-                    <w:jc w:val="left"/>
-                    <w:jc w:val="center"/>
-                  </w:pPr>
-                  <w:r>
-                    <w:t xml:space="preserve">IC inferior</w:t>
-                  </w:r>
-                </w:p>
-              </w:tc>
-              <w:tc>
-                <w:tcPr/>
-                <w:p>
-                  <w:pPr>
-                    <w:pStyle w:val="Compact"/>
-                    <w:jc w:val="left"/>
-                    <w:jc w:val="center"/>
-                  </w:pPr>
-                  <w:r>
-                    <w:t xml:space="preserve">IC superior</w:t>
+                    <w:t xml:space="preserve">Período de retorno</w:t>
+                  </w:r>
+                </w:p>
+              </w:tc>
+              <w:tc>
+                <w:tcPr/>
+                <w:p>
+                  <w:pPr>
+                    <w:pStyle w:val="Compact"/>
+                    <w:jc w:val="left"/>
+                    <w:jc w:val="center"/>
+                  </w:pPr>
+                  <w:r>
+                    <w:t xml:space="preserve">Estimativa (W/m²)</w:t>
+                  </w:r>
+                </w:p>
+              </w:tc>
+              <w:tc>
+                <w:tcPr/>
+                <w:p>
+                  <w:pPr>
+                    <w:pStyle w:val="Compact"/>
+                    <w:jc w:val="left"/>
+                    <w:jc w:val="center"/>
+                  </w:pPr>
+                  <w:r>
+                    <w:t xml:space="preserve">IC 95% (W/m²)</w:t>
                   </w:r>
                 </w:p>
               </w:tc>
@@ -3829,46 +3815,33 @@
                     <w:jc w:val="center"/>
                   </w:pPr>
                   <w:r>
-                    <w:t xml:space="preserve">1</w:t>
-                  </w:r>
-                </w:p>
-              </w:tc>
-              <w:tc>
-                <w:tcPr/>
-                <w:p>
-                  <w:pPr>
-                    <w:pStyle w:val="Compact"/>
-                    <w:jc w:val="left"/>
-                    <w:jc w:val="center"/>
-                  </w:pPr>
-                  <w:r>
-                    <w:t xml:space="preserve">0.002576</w:t>
-                  </w:r>
-                </w:p>
-              </w:tc>
-              <w:tc>
-                <w:tcPr/>
-                <w:p>
-                  <w:pPr>
-                    <w:pStyle w:val="Compact"/>
-                    <w:jc w:val="left"/>
-                    <w:jc w:val="center"/>
-                  </w:pPr>
-                  <w:r>
-                    <w:t xml:space="preserve">4.208e-04</w:t>
-                  </w:r>
-                </w:p>
-              </w:tc>
-              <w:tc>
-                <w:tcPr/>
-                <w:p>
-                  <w:pPr>
-                    <w:pStyle w:val="Compact"/>
-                    <w:jc w:val="left"/>
-                    <w:jc w:val="center"/>
-                  </w:pPr>
-                  <w:r>
-                    <w:t xml:space="preserve">0.009815</w:t>
+                    <w:t xml:space="preserve">1 ano</w:t>
+                  </w:r>
+                </w:p>
+              </w:tc>
+              <w:tc>
+                <w:tcPr/>
+                <w:p>
+                  <w:pPr>
+                    <w:pStyle w:val="Compact"/>
+                    <w:jc w:val="left"/>
+                    <w:jc w:val="center"/>
+                  </w:pPr>
+                  <w:r>
+                    <w:t xml:space="preserve">2,576e-03</w:t>
+                  </w:r>
+                </w:p>
+              </w:tc>
+              <w:tc>
+                <w:tcPr/>
+                <w:p>
+                  <w:pPr>
+                    <w:pStyle w:val="Compact"/>
+                    <w:jc w:val="left"/>
+                    <w:jc w:val="center"/>
+                  </w:pPr>
+                  <w:r>
+                    <w:t xml:space="preserve">(4,208e-04; 9,815e-03)</w:t>
                   </w:r>
                 </w:p>
               </w:tc>
@@ -3883,46 +3856,33 @@
                     <w:jc w:val="center"/>
                   </w:pPr>
                   <w:r>
-                    <w:t xml:space="preserve">2</w:t>
-                  </w:r>
-                </w:p>
-              </w:tc>
-              <w:tc>
-                <w:tcPr/>
-                <w:p>
-                  <w:pPr>
-                    <w:pStyle w:val="Compact"/>
-                    <w:jc w:val="left"/>
-                    <w:jc w:val="center"/>
-                  </w:pPr>
-                  <w:r>
-                    <w:t xml:space="preserve">0.0187</w:t>
-                  </w:r>
-                </w:p>
-              </w:tc>
-              <w:tc>
-                <w:tcPr/>
-                <w:p>
-                  <w:pPr>
-                    <w:pStyle w:val="Compact"/>
-                    <w:jc w:val="left"/>
-                    <w:jc w:val="center"/>
-                  </w:pPr>
-                  <w:r>
-                    <w:t xml:space="preserve">0.001222</w:t>
-                  </w:r>
-                </w:p>
-              </w:tc>
-              <w:tc>
-                <w:tcPr/>
-                <w:p>
-                  <w:pPr>
-                    <w:pStyle w:val="Compact"/>
-                    <w:jc w:val="left"/>
-                    <w:jc w:val="center"/>
-                  </w:pPr>
-                  <w:r>
-                    <w:t xml:space="preserve">0.1019</w:t>
+                    <w:t xml:space="preserve">2 anos</w:t>
+                  </w:r>
+                </w:p>
+              </w:tc>
+              <w:tc>
+                <w:tcPr/>
+                <w:p>
+                  <w:pPr>
+                    <w:pStyle w:val="Compact"/>
+                    <w:jc w:val="left"/>
+                    <w:jc w:val="center"/>
+                  </w:pPr>
+                  <w:r>
+                    <w:t xml:space="preserve">1,870e-02</w:t>
+                  </w:r>
+                </w:p>
+              </w:tc>
+              <w:tc>
+                <w:tcPr/>
+                <w:p>
+                  <w:pPr>
+                    <w:pStyle w:val="Compact"/>
+                    <w:jc w:val="left"/>
+                    <w:jc w:val="center"/>
+                  </w:pPr>
+                  <w:r>
+                    <w:t xml:space="preserve">(1,222e-03; 1,019e-01)</w:t>
                   </w:r>
                 </w:p>
               </w:tc>
@@ -3937,46 +3897,33 @@
                     <w:jc w:val="center"/>
                   </w:pPr>
                   <w:r>
-                    <w:t xml:space="preserve">5</w:t>
-                  </w:r>
-                </w:p>
-              </w:tc>
-              <w:tc>
-                <w:tcPr/>
-                <w:p>
-                  <w:pPr>
-                    <w:pStyle w:val="Compact"/>
-                    <w:jc w:val="left"/>
-                    <w:jc w:val="center"/>
-                  </w:pPr>
-                  <w:r>
-                    <w:t xml:space="preserve">0.2457</w:t>
-                  </w:r>
-                </w:p>
-              </w:tc>
-              <w:tc>
-                <w:tcPr/>
-                <w:p>
-                  <w:pPr>
-                    <w:pStyle w:val="Compact"/>
-                    <w:jc w:val="left"/>
-                    <w:jc w:val="center"/>
-                  </w:pPr>
-                  <w:r>
-                    <w:t xml:space="preserve">0.004057</w:t>
-                  </w:r>
-                </w:p>
-              </w:tc>
-              <w:tc>
-                <w:tcPr/>
-                <w:p>
-                  <w:pPr>
-                    <w:pStyle w:val="Compact"/>
-                    <w:jc w:val="left"/>
-                    <w:jc w:val="center"/>
-                  </w:pPr>
-                  <w:r>
-                    <w:t xml:space="preserve">2.556</w:t>
+                    <w:t xml:space="preserve">5 anos</w:t>
+                  </w:r>
+                </w:p>
+              </w:tc>
+              <w:tc>
+                <w:tcPr/>
+                <w:p>
+                  <w:pPr>
+                    <w:pStyle w:val="Compact"/>
+                    <w:jc w:val="left"/>
+                    <w:jc w:val="center"/>
+                  </w:pPr>
+                  <w:r>
+                    <w:t xml:space="preserve">2,457e-01</w:t>
+                  </w:r>
+                </w:p>
+              </w:tc>
+              <w:tc>
+                <w:tcPr/>
+                <w:p>
+                  <w:pPr>
+                    <w:pStyle w:val="Compact"/>
+                    <w:jc w:val="left"/>
+                    <w:jc w:val="center"/>
+                  </w:pPr>
+                  <w:r>
+                    <w:t xml:space="preserve">(4,057e-03; 2,556e+00)</w:t>
                   </w:r>
                 </w:p>
               </w:tc>
@@ -3991,46 +3938,33 @@
                     <w:jc w:val="center"/>
                   </w:pPr>
                   <w:r>
-                    <w:t xml:space="preserve">10</w:t>
-                  </w:r>
-                </w:p>
-              </w:tc>
-              <w:tc>
-                <w:tcPr/>
-                <w:p>
-                  <w:pPr>
-                    <w:pStyle w:val="Compact"/>
-                    <w:jc w:val="left"/>
-                    <w:jc w:val="center"/>
-                  </w:pPr>
-                  <w:r>
-                    <w:t xml:space="preserve">1.698</w:t>
-                  </w:r>
-                </w:p>
-              </w:tc>
-              <w:tc>
-                <w:tcPr/>
-                <w:p>
-                  <w:pPr>
-                    <w:pStyle w:val="Compact"/>
-                    <w:jc w:val="left"/>
-                    <w:jc w:val="center"/>
-                  </w:pPr>
-                  <w:r>
-                    <w:t xml:space="preserve">0.009712</w:t>
-                  </w:r>
-                </w:p>
-              </w:tc>
-              <w:tc>
-                <w:tcPr/>
-                <w:p>
-                  <w:pPr>
-                    <w:pStyle w:val="Compact"/>
-                    <w:jc w:val="left"/>
-                    <w:jc w:val="center"/>
-                  </w:pPr>
-                  <w:r>
-                    <w:t xml:space="preserve">26.51</w:t>
+                    <w:t xml:space="preserve">10 anos</w:t>
+                  </w:r>
+                </w:p>
+              </w:tc>
+              <w:tc>
+                <w:tcPr/>
+                <w:p>
+                  <w:pPr>
+                    <w:pStyle w:val="Compact"/>
+                    <w:jc w:val="left"/>
+                    <w:jc w:val="center"/>
+                  </w:pPr>
+                  <w:r>
+                    <w:t xml:space="preserve">1,698e+00</w:t>
+                  </w:r>
+                </w:p>
+              </w:tc>
+              <w:tc>
+                <w:tcPr/>
+                <w:p>
+                  <w:pPr>
+                    <w:pStyle w:val="Compact"/>
+                    <w:jc w:val="left"/>
+                    <w:jc w:val="center"/>
+                  </w:pPr>
+                  <w:r>
+                    <w:t xml:space="preserve">(9,712e-03; 2,651e+01)</w:t>
                   </w:r>
                 </w:p>
               </w:tc>
@@ -4041,6 +3975,58 @@
         </w:tc>
       </w:tr>
     </w:tbl>
+    <w:p>
+      <w:pPr>
+        <w:pStyle w:val="BodyText"/>
+      </w:pPr>
+      <w:r>
+        <w:rPr>
+          <w:b/>
+          <w:bCs/>
+        </w:rPr>
+        <w:t xml:space="preserve">Nota:</w:t>
+      </w:r>
+      <w:r>
+        <w:t xml:space="preserve"> </w:t>
+      </w:r>
+      <w:r>
+        <w:t xml:space="preserve">IC percentis de 95% obtidos por</w:t>
+      </w:r>
+      <w:r>
+        <w:t xml:space="preserve"> </w:t>
+      </w:r>
+      <w:r>
+        <w:rPr>
+          <w:b/>
+          <w:bCs/>
+        </w:rPr>
+        <w:t xml:space="preserve">bootstrap circular de blocos móveis</w:t>
+      </w:r>
+      <w:r>
+        <w:t xml:space="preserve">, na grade mensal com lacunas preservadas. Os limites estão na mesma unidade da estimativa (W/m²); não são os intervalos da Hessiana. Foram mantidos os horizontes já calculados: 1, 2, 5 e 10 anos, correspondentes a 12, 24, 60 e 120 blocos mensais.</w:t>
+      </w:r>
+    </w:p>
+    <w:p>
+      <w:pPr>
+        <w:pStyle w:val="BodyText"/>
+      </w:pPr>
+      <w:r>
+        <w:t xml:space="preserve">Os níveis de retorno aumentam com o período, pois representam quantis progressivamente mais extremos da GEV ajustada aos máximos mensais. Entretanto, os diagnósticos indicam que a GEV estacionária global produz uma cauda superior excessivamente pesada em relação aos máximos observados. Assim, estes são</w:t>
+      </w:r>
+      <w:r>
+        <w:t xml:space="preserve"> </w:t>
+      </w:r>
+      <w:r>
+        <w:rPr>
+          <w:b/>
+          <w:bCs/>
+        </w:rPr>
+        <w:t xml:space="preserve">níveis de retorno formais do modelo estimado, não previsões solares confiáveis da intensidade de eventos futuros</w:t>
+      </w:r>
+      <w:r>
+        <w:t xml:space="preserve">. A tabela e a curva seguinte utilizam o mesmo ajuste e as mesmas replicações bootstrap.</w:t>
+      </w:r>
+    </w:p>
     <w:p>
       <w:pPr>
         <w:pStyle w:val="BodyText"/>

</xml_diff>

<commit_message>
Explica interpretação e incerteza dos níveis de retorno GEV
</commit_message>
<xml_diff>
--- a/docs/relatorio.docx
+++ b/docs/relatorio.docx
@@ -3980,17 +3980,45 @@
         <w:pStyle w:val="BodyText"/>
       </w:pPr>
       <w:r>
+        <w:t xml:space="preserve">A</w:t>
+      </w:r>
+      <w:r>
+        <w:t xml:space="preserve"> </w:t>
+      </w:r>
+      <w:hyperlink w:anchor="tbl-retornos">
+        <w:r>
+          <w:rPr>
+            <w:rStyle w:val="Hyperlink"/>
+          </w:rPr>
+          <w:t xml:space="preserve">Tabela 4</w:t>
+        </w:r>
+      </w:hyperlink>
+      <w:r>
+        <w:t xml:space="preserve"> </w:t>
+      </w:r>
+      <w:r>
+        <w:t xml:space="preserve">apresenta as estimativas pontuais dos níveis de retorno do fluxo solar XRS-B e seus intervalos de confiança de 95%, para os horizontes de 1, 2, 5, 10 anos. Os valores são quantis da GEV ajustada aos</w:t>
+      </w:r>
+      <w:r>
+        <w:t xml:space="preserve"> </w:t>
+      </w:r>
+      <w:r>
         <w:rPr>
           <w:b/>
           <w:bCs/>
         </w:rPr>
-        <w:t xml:space="preserve">Nota:</w:t>
-      </w:r>
-      <w:r>
-        <w:t xml:space="preserve"> </w:t>
-      </w:r>
-      <w:r>
-        <w:t xml:space="preserve">IC percentis de 95% obtidos por</w:t>
+        <w:t xml:space="preserve">94 máximos mensais elegíveis</w:t>
+      </w:r>
+      <w:r>
+        <w:t xml:space="preserve">, não à totalidade dos minutos individuais. A coluna central informa o nível estimado, e a última reúne os limites inferior e superior, nessa ordem, ambos em W/m². Os intervalos principais vêm do bootstrap circular de blocos móveis, mantendo a grade mensal e suas lacunas.</w:t>
+      </w:r>
+    </w:p>
+    <w:p>
+      <w:pPr>
+        <w:pStyle w:val="BodyText"/>
+      </w:pPr>
+      <w:r>
+        <w:t xml:space="preserve">Nesta aplicação, cada ano corresponde a 12 blocos mensais. Assim, os horizontes da tabela equivalem a 12, 24, 60, 120 blocos, respectivamente. O período de retorno expressa uma</w:t>
       </w:r>
       <w:r>
         <w:t xml:space="preserve"> </w:t>
@@ -4000,10 +4028,88 @@
           <w:b/>
           <w:bCs/>
         </w:rPr>
-        <w:t xml:space="preserve">bootstrap circular de blocos móveis</w:t>
-      </w:r>
-      <w:r>
-        <w:t xml:space="preserve">, na grade mensal com lacunas preservadas. Os limites estão na mesma unidade da estimativa (W/m²); não são os intervalos da Hessiana. Foram mantidos os horizontes já calculados: 1, 2, 5 e 10 anos, correspondentes a 12, 24, 60 e 120 blocos mensais.</w:t>
+        <w:t xml:space="preserve">probabilidade de excedência por mês</w:t>
+      </w:r>
+      <w:r>
+        <w:t xml:space="preserve">: para um horizonte de</w:t>
+      </w:r>
+      <w:r>
+        <w:t xml:space="preserve"> </w:t>
+      </w:r>
+      <m:oMath>
+        <m:r>
+          <m:t>T</m:t>
+        </m:r>
+      </m:oMath>
+      <w:r>
+        <w:t xml:space="preserve"> </w:t>
+      </w:r>
+      <w:r>
+        <w:t xml:space="preserve">anos, ela é</w:t>
+      </w:r>
+      <w:r>
+        <w:t xml:space="preserve"> </w:t>
+      </w:r>
+      <m:oMath>
+        <m:r>
+          <m:t>1</m:t>
+        </m:r>
+        <m:r>
+          <m:rPr>
+            <m:sty m:val="p"/>
+          </m:rPr>
+          <m:t>/</m:t>
+        </m:r>
+        <m:d>
+          <m:dPr>
+            <m:begChr m:val="("/>
+            <m:sepChr m:val=""/>
+            <m:endChr m:val=")"/>
+            <m:grow/>
+          </m:dPr>
+          <m:e>
+            <m:r>
+              <m:t>12</m:t>
+            </m:r>
+            <m:r>
+              <m:t>T</m:t>
+            </m:r>
+          </m:e>
+        </m:d>
+      </m:oMath>
+      <w:r>
+        <w:t xml:space="preserve">. Apenas sob estabilidade da distribuição e independência aproximada a espera média teria a interpretação de</w:t>
+      </w:r>
+      <w:r>
+        <w:t xml:space="preserve"> </w:t>
+      </w:r>
+      <m:oMath>
+        <m:r>
+          <m:t>12</m:t>
+        </m:r>
+        <m:r>
+          <m:t>T</m:t>
+        </m:r>
+      </m:oMath>
+      <w:r>
+        <w:t xml:space="preserve"> </w:t>
+      </w:r>
+      <w:r>
+        <w:t xml:space="preserve">meses. Isso não estabelece uma data para a ocorrência: meses com excedências podem se agrupar, e um intervalo de duração</w:t>
+      </w:r>
+      <w:r>
+        <w:t xml:space="preserve"> </w:t>
+      </w:r>
+      <m:oMath>
+        <m:r>
+          <m:t>T</m:t>
+        </m:r>
+      </m:oMath>
+      <w:r>
+        <w:t xml:space="preserve"> </w:t>
+      </w:r>
+      <w:r>
+        <w:t xml:space="preserve">também pode transcorrer sem nenhuma. A dependência e a heterogeneidade observadas nesta base limitam essa leitura como tempo de espera.</w:t>
       </w:r>
     </w:p>
     <w:p>
@@ -4011,7 +4117,7 @@
         <w:pStyle w:val="BodyText"/>
       </w:pPr>
       <w:r>
-        <w:t xml:space="preserve">Os níveis de retorno aumentam com o período, pois representam quantis progressivamente mais extremos da GEV ajustada aos máximos mensais. Entretanto, os diagnósticos indicam que a GEV estacionária global produz uma cauda superior excessivamente pesada em relação aos máximos observados. Assim, estes são</w:t>
+        <w:t xml:space="preserve">Para o horizonte mais curto, de</w:t>
       </w:r>
       <w:r>
         <w:t xml:space="preserve"> </w:t>
@@ -4021,10 +4127,36 @@
           <w:b/>
           <w:bCs/>
         </w:rPr>
-        <w:t xml:space="preserve">níveis de retorno formais do modelo estimado, não previsões solares confiáveis da intensidade de eventos futuros</w:t>
-      </w:r>
-      <w:r>
-        <w:t xml:space="preserve">. A tabela e a curva seguinte utilizam o mesmo ajuste e as mesmas replicações bootstrap.</w:t>
+        <w:t xml:space="preserve">1 ano</w:t>
+      </w:r>
+      <w:r>
+        <w:t xml:space="preserve">, o modelo fornece</w:t>
+      </w:r>
+      <w:r>
+        <w:t xml:space="preserve"> </w:t>
+      </w:r>
+      <w:r>
+        <w:rPr>
+          <w:b/>
+          <w:bCs/>
+        </w:rPr>
+        <w:t xml:space="preserve">2,576e-03 W/m²</w:t>
+      </w:r>
+      <w:r>
+        <w:t xml:space="preserve">, com IC 95% de 4,208e-04 a 9,815e-03 W/m². Esse nível corresponde, segundo a GEV estimada, a uma probabilidade mensal de ultrapassagem de aproximadamente</w:t>
+      </w:r>
+      <w:r>
+        <w:t xml:space="preserve"> </w:t>
+      </w:r>
+      <w:r>
+        <w:rPr>
+          <w:b/>
+          <w:bCs/>
+        </w:rPr>
+        <w:t xml:space="preserve">8,33%</w:t>
+      </w:r>
+      <w:r>
+        <w:t xml:space="preserve">. Trata-se de identificar qual intensidade ocupa essa posição extrema da distribuição ajustada; não de afirmar que tal intensidade será atingida ao completar um ano. O intervalo acompanha a incerteza da estimação desse quantil, não a duração até um próximo episódio.</w:t>
       </w:r>
     </w:p>
     <w:p>
@@ -4032,7 +4164,205 @@
         <w:pStyle w:val="BodyText"/>
       </w:pPr>
       <w:r>
-        <w:t xml:space="preserve">O nível de um ano já é 1.76 vezes o maior fluxo observado. Não houve excedências desse nível, embora o modelo constante esperasse aproximadamente 7.8 na amostra mensal. Isso explicita a má calibração. O nível de dez anos é cerca de 1.160 vezes o máximo da base e extrapola uma janela observada de pouco mais de oito anos.</w:t>
+        <w:t xml:space="preserve">No horizonte mais longo, de</w:t>
+      </w:r>
+      <w:r>
+        <w:t xml:space="preserve"> </w:t>
+      </w:r>
+      <w:r>
+        <w:rPr>
+          <w:b/>
+          <w:bCs/>
+        </w:rPr>
+        <w:t xml:space="preserve">10 anos</w:t>
+      </w:r>
+      <w:r>
+        <w:t xml:space="preserve">, a estimativa é</w:t>
+      </w:r>
+      <w:r>
+        <w:t xml:space="preserve"> </w:t>
+      </w:r>
+      <w:r>
+        <w:rPr>
+          <w:b/>
+          <w:bCs/>
+        </w:rPr>
+        <w:t xml:space="preserve">1,698e+00 W/m²</w:t>
+      </w:r>
+      <w:r>
+        <w:t xml:space="preserve">, com IC 95% de 9,712e-03 a 2,651e+01 W/m². A probabilidade de excedência atribuída pelo modelo é de aproximadamente</w:t>
+      </w:r>
+      <w:r>
+        <w:t xml:space="preserve"> </w:t>
+      </w:r>
+      <w:r>
+        <w:rPr>
+          <w:b/>
+          <w:bCs/>
+        </w:rPr>
+        <w:t xml:space="preserve">0,83% por mês</w:t>
+      </w:r>
+      <w:r>
+        <w:t xml:space="preserve">, correspondente a um quantil mais extremo. Esse horizonte já ultrapassa a duração da série observada, de modo que sua interpretação depende fortemente da extrapolação da cauda, e não da observação repetida de eventos com essa magnitude. A tabela, por si só, não comprova que o processo solar produza tais intensidades com essa frequência.</w:t>
+      </w:r>
+    </w:p>
+    <w:p>
+      <w:pPr>
+        <w:pStyle w:val="BodyText"/>
+      </w:pPr>
+      <w:r>
+        <w:t xml:space="preserve">A comparação entre os extremos da tabela mostra um crescimento muito acentuado: o nível de 10 anos é cerca de</w:t>
+      </w:r>
+      <w:r>
+        <w:t xml:space="preserve"> </w:t>
+      </w:r>
+      <w:r>
+        <w:rPr>
+          <w:b/>
+          <w:bCs/>
+        </w:rPr>
+        <w:t xml:space="preserve">659,1 vezes</w:t>
+      </w:r>
+      <w:r>
+        <w:t xml:space="preserve"> </w:t>
+      </w:r>
+      <w:r>
+        <w:t xml:space="preserve">o de 1 ano. A amplitude do IC, calculada como limite superior menos inferior, passa de</w:t>
+      </w:r>
+      <w:r>
+        <w:t xml:space="preserve"> </w:t>
+      </w:r>
+      <w:r>
+        <w:rPr>
+          <w:b/>
+          <w:bCs/>
+        </w:rPr>
+        <w:t xml:space="preserve">9,394e-03 W/m²</w:t>
+      </w:r>
+      <w:r>
+        <w:t xml:space="preserve"> </w:t>
+      </w:r>
+      <w:r>
+        <w:t xml:space="preserve">para</w:t>
+      </w:r>
+      <w:r>
+        <w:t xml:space="preserve"> </w:t>
+      </w:r>
+      <w:r>
+        <w:rPr>
+          <w:b/>
+          <w:bCs/>
+        </w:rPr>
+        <w:t xml:space="preserve">2,650e+01 W/m²</w:t>
+      </w:r>
+      <w:r>
+        <w:t xml:space="preserve">. Portanto, nesta tabela a incerteza aumenta também em escala absoluta. O rápido crescimento dos quantis é coerente com a forma estimada elevada,</w:t>
+      </w:r>
+      <w:r>
+        <w:t xml:space="preserve"> </w:t>
+      </w:r>
+      <m:oMath>
+        <m:acc>
+          <m:accPr>
+            <m:chr m:val="̂"/>
+          </m:accPr>
+          <m:e>
+            <m:r>
+              <m:t>ξ</m:t>
+            </m:r>
+          </m:e>
+        </m:acc>
+        <m:r>
+          <m:rPr>
+            <m:sty m:val="p"/>
+          </m:rPr>
+          <m:t>=</m:t>
+        </m:r>
+      </m:oMath>
+      <w:r>
+        <w:t xml:space="preserve"> </w:t>
+      </w:r>
+      <w:r>
+        <w:t xml:space="preserve">2,772, mas revela uma consequência da cauda do modelo agregado, não uma lei física estabelecida para o Sol.</w:t>
+      </w:r>
+    </w:p>
+    <w:p>
+      <w:pPr>
+        <w:pStyle w:val="BodyText"/>
+      </w:pPr>
+      <w:r>
+        <w:t xml:space="preserve">Os IC de 95% resumem a variação das estimativas nas</w:t>
+      </w:r>
+      <w:r>
+        <w:t xml:space="preserve"> </w:t>
+      </w:r>
+      <w:r>
+        <w:rPr>
+          <w:b/>
+          <w:bCs/>
+        </w:rPr>
+        <w:t xml:space="preserve">399 replicações válidas</w:t>
+      </w:r>
+      <w:r>
+        <w:t xml:space="preserve"> </w:t>
+      </w:r>
+      <w:r>
+        <w:t xml:space="preserve">do bootstrap, que reamostra segmentos de 5 meses. Se as hipóteses do modelo e da reamostragem fossem adequadas, cerca de 95% dos intervalos construídos em muitas repetições hipotéticas do estudo conteriam o nível de retorno populacional correspondente. Esse é o sentido frequentista de cobertura de 95%. Não se atribui uma probabilidade de 95% ao parâmetro fixo estar neste intervalo específico, nem se afirma que 95% dos fluxos observados estejam entre os limites. Nos horizontes longos há menos informação empírica sobre a região da cauda considerada, o que ajuda a compreender os intervalos mais amplos. Como o ajuste apresenta limitações, a cobertura aqui é nominal: o bootstrap preserva parte da dependência local, mas não corrige a má especificação ou toda a mudança temporal.</w:t>
+      </w:r>
+    </w:p>
+    <w:p>
+      <w:pPr>
+        <w:pStyle w:val="BodyText"/>
+      </w:pPr>
+      <w:r>
+        <w:t xml:space="preserve">Em termos do objeto estudado, os níveis representam intensidades extremas do fluxo de raios X registrado pelo canal XRS-B, calculadas a partir de médias de um minuto. Um fluxo maior indica maior intensidade registrada nesse canal, sem identificar automaticamente uma erupção física ou atribuir-lhe uma classe operacional. A comparação com a própria amostra evidencia a dificuldade do ajuste: o nível formal de 1 ano já equivale a</w:t>
+      </w:r>
+      <w:r>
+        <w:t xml:space="preserve"> </w:t>
+      </w:r>
+      <w:r>
+        <w:rPr>
+          <w:b/>
+          <w:bCs/>
+        </w:rPr>
+        <w:t xml:space="preserve">1,76 vezes o maior fluxo observado</w:t>
+      </w:r>
+      <w:r>
+        <w:t xml:space="preserve">. Ele teve 0 excedências, embora a GEV constante esperasse cerca de 7,8 entre os máximos elegíveis. Para 10 anos, a estimativa alcança cerca de 1.159,6 vezes o máximo observado. A distância não deve ser confundida com evidência de eventos solares dessa magnitude.</w:t>
+      </w:r>
+    </w:p>
+    <w:p>
+      <w:pPr>
+        <w:pStyle w:val="BodyText"/>
+      </w:pPr>
+      <w:r>
+        <w:t xml:space="preserve">Esses contrastes precisam ser lidos em conjunto com os diagnósticos anteriores: a</w:t>
+      </w:r>
+      <w:r>
+        <w:t xml:space="preserve"> </w:t>
+      </w:r>
+      <w:r>
+        <w:rPr>
+          <w:b/>
+          <w:bCs/>
+        </w:rPr>
+        <w:t xml:space="preserve">GEV estacionária global produz uma cauda superior excessivamente pesada em relação aos máximos observados</w:t>
+      </w:r>
+      <w:r>
+        <w:t xml:space="preserve">. Os níveis são úteis para explicitar as consequências matemáticas desse ajuste, mas seu crescimento e seus IC não validam a extrapolação. Os níveis de 5 e 10 anos também ultrapassam o limite valid_max declarado no produto (2,000e-01 W/m²), o que exige ressalva instrumental; esse limite não é uma barreira física demonstrada para o Sol. Assim, especialmente nos horizontes longos, a tabela apresenta</w:t>
+      </w:r>
+      <w:r>
+        <w:t xml:space="preserve"> </w:t>
+      </w:r>
+      <w:r>
+        <w:rPr>
+          <w:b/>
+          <w:bCs/>
+        </w:rPr>
+        <w:t xml:space="preserve">resultados formais e condicionais ao modelo, não previsões operacionais confiáveis da intensidade de eventos solares futuros</w:t>
+      </w:r>
+      <w:r>
+        <w:t xml:space="preserve">.</w:t>
       </w:r>
     </w:p>
     <w:tbl>
@@ -4119,45 +4449,7 @@
         <w:pStyle w:val="BodyText"/>
       </w:pPr>
       <w:r>
-        <w:t xml:space="preserve">Para ler a curva, escolhe-se um período no eixo horizontal e consulta-se a magnitude estimada no vertical. A faixa cresce muito em escala absoluta para períodos maiores, mostrando a incerteza da extrapolação.</w:t>
-      </w:r>
-      <w:r>
-        <w:t xml:space="preserve"> </w:t>
-      </w:r>
-      <w:r>
-        <w:rPr>
-          <w:b/>
-          <w:bCs/>
-        </w:rPr>
-        <w:t xml:space="preserve">Dez anos não é uma data marcada para um evento:</w:t>
-      </w:r>
-      <w:r>
-        <w:t xml:space="preserve"> </w:t>
-      </w:r>
-      <w:r>
-        <w:t xml:space="preserve">corresponde à probabilidade mensal definida na</w:t>
-      </w:r>
-      <w:r>
-        <w:t xml:space="preserve"> </w:t>
-      </w:r>
-      <w:hyperlink w:anchor="eq-retorno">
-        <w:r>
-          <w:rPr>
-            <w:rStyle w:val="Hyperlink"/>
-          </w:rPr>
-          <w:t xml:space="preserve">Equação 2</w:t>
-        </w:r>
-      </w:hyperlink>
-      <w:r>
-        <w:t xml:space="preserve">, sob hipóteses que não estão plenamente satisfeitas aqui.</w:t>
-      </w:r>
-    </w:p>
-    <w:p>
-      <w:pPr>
-        <w:pStyle w:val="BodyText"/>
-      </w:pPr>
-      <w:r>
-        <w:t xml:space="preserve">O bootstrap teve 399 ajustes válidos em 399 tentativas. Ainda assim, sua faixa não incorpora toda a incerteza por má especificação, dependência de longo alcance ou mudança temporal. Os níveis de 5 e 10 anos também ultrapassam valid_max do produto (2.000e-01 W/m²). Esse é um limite declarado de validade instrumental, não um limite físico demonstrado para o Sol.</w:t>
+        <w:t xml:space="preserve">No gráfico, o eixo horizontal representa o período de retorno e o vertical, o fluxo. A linha corresponde aos quantis pontuais, a faixa aos IC bootstrap e os pontos aos máximos observados com posições empíricas. As escalas logarítmicas tornam visível o crescimento, mas não reduzem a distância entre as extrapolações e os dados. A curva e a tabela utilizam o mesmo ajuste e as mesmas replicações.</w:t>
       </w:r>
     </w:p>
     <w:bookmarkEnd w:id="78"/>

</xml_diff>

<commit_message>
Acrescenta histograma dos máximos mensais antes da GEV
</commit_message>
<xml_diff>
--- a/docs/relatorio.docx
+++ b/docs/relatorio.docx
@@ -23,7 +23,7 @@
         <w:pStyle w:val="Date"/>
       </w:pPr>
       <w:r>
-        <w:t xml:space="preserve">2026-10-27</w:t>
+        <w:t xml:space="preserve">2026-10-28</w:t>
       </w:r>
     </w:p>
     <w:sdt>
@@ -1289,7 +1289,7 @@
       </w:r>
     </w:p>
     <w:bookmarkEnd w:id="29"/>
-    <w:bookmarkStart w:id="86" w:name="resultados"/>
+    <w:bookmarkStart w:id="90" w:name="resultados"/>
     <w:p>
       <w:pPr>
         <w:pStyle w:val="Heading1"/>
@@ -2889,7 +2889,7 @@
       </w:r>
     </w:p>
     <w:bookmarkEnd w:id="57"/>
-    <w:bookmarkStart w:id="62" w:name="série-histórica-dos-máximos-mensais"/>
+    <w:bookmarkStart w:id="66" w:name="série-histórica-dos-máximos-mensais"/>
     <w:p>
       <w:pPr>
         <w:pStyle w:val="Heading2"/>
@@ -3006,54 +3006,6 @@
         <w:t xml:space="preserve">O maior máximo é 1.464e-03 W/m², no bloco iniciado em 09/2017. Os pontos menores também são relevantes: o modelo precisa representar a distribuição de todos os máximos elegíveis, não apenas os maiores. A evolução temporal sugere que reuni-los em uma única distribuição constante pode ser uma aproximação forte.</w:t>
       </w:r>
     </w:p>
-    <w:bookmarkEnd w:id="62"/>
-    <w:bookmarkStart w:id="72" w:name="ajuste-da-gev"/>
-    <w:p>
-      <w:pPr>
-        <w:pStyle w:val="Heading2"/>
-      </w:pPr>
-      <w:r>
-        <w:t xml:space="preserve">4.5 Ajuste da GEV</w:t>
-      </w:r>
-    </w:p>
-    <w:p>
-      <w:pPr>
-        <w:pStyle w:val="FirstParagraph"/>
-      </w:pPr>
-      <w:r>
-        <w:t xml:space="preserve">A GEV estacionária convergiu numericamente, mas apresentou uma</w:t>
-      </w:r>
-      <w:r>
-        <w:t xml:space="preserve"> </w:t>
-      </w:r>
-      <w:r>
-        <w:rPr>
-          <w:b/>
-          <w:bCs/>
-        </w:rPr>
-        <w:t xml:space="preserve">forma muito elevada</w:t>
-      </w:r>
-      <w:r>
-        <w:t xml:space="preserve">. A</w:t>
-      </w:r>
-      <w:r>
-        <w:t xml:space="preserve"> </w:t>
-      </w:r>
-      <w:hyperlink w:anchor="tbl-parametros">
-        <w:r>
-          <w:rPr>
-            <w:rStyle w:val="Hyperlink"/>
-          </w:rPr>
-          <w:t xml:space="preserve">Tabela 3</w:t>
-        </w:r>
-      </w:hyperlink>
-      <w:r>
-        <w:t xml:space="preserve"> </w:t>
-      </w:r>
-      <w:r>
-        <w:t xml:space="preserve">combina as estimativas originais com os intervalos de bootstrap móvel, mais adequados à intenção de preservar dependência local do que interpretar erros padrão como se os meses fossem independentes.</w:t>
-      </w:r>
-    </w:p>
     <w:tbl>
       <w:tblPr>
         <w:tblStyle w:val="Table"/>
@@ -3067,7 +3019,142 @@
       <w:tr>
         <w:tc>
           <w:tcPr/>
-          <w:bookmarkStart w:id="63" w:name="tbl-parametros"/>
+          <w:bookmarkStart w:id="65" w:name="fig-histograma-mensal"/>
+          <w:p>
+            <w:pPr>
+              <w:pStyle w:val="Compact"/>
+              <w:jc w:val="center"/>
+            </w:pPr>
+            <w:r>
+              <w:drawing>
+                <wp:inline>
+                  <wp:extent cx="5537835" cy="2827030"/>
+                  <wp:effectExtent b="0" l="0" r="0" t="0"/>
+                  <wp:docPr descr="" title="" id="63" name="Picture"/>
+                  <a:graphic>
+                    <a:graphicData uri="http://schemas.openxmlformats.org/drawingml/2006/picture">
+                      <pic:pic>
+                        <pic:nvPicPr>
+                          <pic:cNvPr descr="figuras/histograma_maximos_mensais.png" id="64" name="Picture"/>
+                          <pic:cNvPicPr>
+                            <a:picLocks noChangeArrowheads="1" noChangeAspect="1"/>
+                          </pic:cNvPicPr>
+                        </pic:nvPicPr>
+                        <pic:blipFill>
+                          <a:blip r:embed="rId62"/>
+                          <a:stretch>
+                            <a:fillRect/>
+                          </a:stretch>
+                        </pic:blipFill>
+                        <pic:spPr bwMode="auto">
+                          <a:xfrm>
+                            <a:off x="0" y="0"/>
+                            <a:ext cx="5537835" cy="2827030"/>
+                          </a:xfrm>
+                          <a:prstGeom prst="rect">
+                            <a:avLst/>
+                          </a:prstGeom>
+                          <a:noFill/>
+                          <a:ln w="9525">
+                            <a:noFill/>
+                            <a:headEnd/>
+                            <a:tailEnd/>
+                          </a:ln>
+                        </pic:spPr>
+                      </pic:pic>
+                    </a:graphicData>
+                  </a:graphic>
+                </wp:inline>
+              </w:drawing>
+            </w:r>
+          </w:p>
+          <w:p>
+            <w:pPr>
+              <w:jc w:val="center"/>
+            </w:pPr>
+            <w:pPr>
+              <w:jc w:val="start"/>
+              <w:spacing w:before="200"/>
+              <w:pStyle w:val="ImageCaption"/>
+            </w:pPr>
+            <w:r>
+              <w:t xml:space="preserve">Figura 7: Distribuição dos mesmos máximos mensais elegíveis utilizados na GEV principal, com o critério de cobertura já definido. Frequências em classes de largura igual pela regra de Sturges, na escala original do fluxo, sem exclusão dos maiores valores.</w:t>
+            </w:r>
+          </w:p>
+          <w:bookmarkEnd w:id="65"/>
+        </w:tc>
+      </w:tr>
+    </w:tbl>
+    <w:p>
+      <w:pPr>
+        <w:pStyle w:val="BodyText"/>
+      </w:pPr>
+      <w:r>
+        <w:t xml:space="preserve">Observa-se forte assimetria à direita na distribuição dos máximos mensais. A maior parte dos blocos apresenta máximos relativamente menores, enquanto poucos meses concentram valores substancialmente mais elevados, formando uma cauda superior pronunciada. Esse comportamento reforça o interesse em modelar especificamente os extremos por meio da distribuição GEV. Entretanto, a presença visual de uma cauda direita não implica, por si só, que uma GEV de cauda muito pesada forneça um ajuste adequado; essa questão é avaliada posteriormente pelos diagnósticos do modelo. O histograma e o ajuste GEV utilizam o fluxo na escala original, em W/m².</w:t>
+      </w:r>
+    </w:p>
+    <w:bookmarkEnd w:id="66"/>
+    <w:bookmarkStart w:id="76" w:name="ajuste-da-gev"/>
+    <w:p>
+      <w:pPr>
+        <w:pStyle w:val="Heading2"/>
+      </w:pPr>
+      <w:r>
+        <w:t xml:space="preserve">4.5 Ajuste da GEV</w:t>
+      </w:r>
+    </w:p>
+    <w:p>
+      <w:pPr>
+        <w:pStyle w:val="FirstParagraph"/>
+      </w:pPr>
+      <w:r>
+        <w:t xml:space="preserve">A GEV estacionária convergiu numericamente, mas apresentou uma</w:t>
+      </w:r>
+      <w:r>
+        <w:t xml:space="preserve"> </w:t>
+      </w:r>
+      <w:r>
+        <w:rPr>
+          <w:b/>
+          <w:bCs/>
+        </w:rPr>
+        <w:t xml:space="preserve">forma muito elevada</w:t>
+      </w:r>
+      <w:r>
+        <w:t xml:space="preserve">. A</w:t>
+      </w:r>
+      <w:r>
+        <w:t xml:space="preserve"> </w:t>
+      </w:r>
+      <w:hyperlink w:anchor="tbl-parametros">
+        <w:r>
+          <w:rPr>
+            <w:rStyle w:val="Hyperlink"/>
+          </w:rPr>
+          <w:t xml:space="preserve">Tabela 3</w:t>
+        </w:r>
+      </w:hyperlink>
+      <w:r>
+        <w:t xml:space="preserve"> </w:t>
+      </w:r>
+      <w:r>
+        <w:t xml:space="preserve">combina as estimativas originais com os intervalos de bootstrap móvel, mais adequados à intenção de preservar dependência local do que interpretar erros padrão como se os meses fossem independentes.</w:t>
+      </w:r>
+    </w:p>
+    <w:tbl>
+      <w:tblPr>
+        <w:tblStyle w:val="Table"/>
+        <w:tblW w:type="pct" w:w="5000"/>
+        <w:tblLayout w:type="fixed"/>
+        <w:tblLook w:firstRow="0" w:lastRow="0" w:firstColumn="0" w:lastColumn="0" w:noHBand="0" w:noVBand="0" w:val="0000"/>
+      </w:tblPr>
+      <w:tblGrid>
+        <w:gridCol w:w="7920"/>
+      </w:tblGrid>
+      <w:tr>
+        <w:tc>
+          <w:tcPr/>
+          <w:bookmarkStart w:id="67" w:name="tbl-parametros"/>
           <w:p>
             <w:pPr>
               <w:jc w:val="center"/>
@@ -3377,7 +3464,7 @@
               </w:tc>
             </w:tr>
           </w:tbl>
-          <w:bookmarkEnd w:id="63"/>
+          <w:bookmarkEnd w:id="67"/>
           <w:p/>
         </w:tc>
       </w:tr>
@@ -3520,94 +3607,7 @@
       <w:tr>
         <w:tc>
           <w:tcPr/>
-          <w:bookmarkStart w:id="67" w:name="fig-qq-gev-principal"/>
-          <w:p>
-            <w:pPr>
-              <w:pStyle w:val="Compact"/>
-              <w:jc w:val="center"/>
-            </w:pPr>
-            <w:r>
-              <w:drawing>
-                <wp:inline>
-                  <wp:extent cx="5829300" cy="2975821"/>
-                  <wp:effectExtent b="0" l="0" r="0" t="0"/>
-                  <wp:docPr descr="" title="" id="65" name="Picture"/>
-                  <a:graphic>
-                    <a:graphicData uri="http://schemas.openxmlformats.org/drawingml/2006/picture">
-                      <pic:pic>
-                        <pic:nvPicPr>
-                          <pic:cNvPr descr="figuras/qq_gev_mensal.png" id="66" name="Picture"/>
-                          <pic:cNvPicPr>
-                            <a:picLocks noChangeArrowheads="1" noChangeAspect="1"/>
-                          </pic:cNvPicPr>
-                        </pic:nvPicPr>
-                        <pic:blipFill>
-                          <a:blip r:embed="rId64"/>
-                          <a:stretch>
-                            <a:fillRect/>
-                          </a:stretch>
-                        </pic:blipFill>
-                        <pic:spPr bwMode="auto">
-                          <a:xfrm>
-                            <a:off x="0" y="0"/>
-                            <a:ext cx="5829300" cy="2975821"/>
-                          </a:xfrm>
-                          <a:prstGeom prst="rect">
-                            <a:avLst/>
-                          </a:prstGeom>
-                          <a:noFill/>
-                          <a:ln w="9525">
-                            <a:noFill/>
-                            <a:headEnd/>
-                            <a:tailEnd/>
-                          </a:ln>
-                        </pic:spPr>
-                      </pic:pic>
-                    </a:graphicData>
-                  </a:graphic>
-                </wp:inline>
-              </w:drawing>
-            </w:r>
-          </w:p>
-          <w:p>
-            <w:pPr>
-              <w:jc w:val="center"/>
-            </w:pPr>
-            <w:pPr>
-              <w:jc w:val="start"/>
-              <w:spacing w:before="200"/>
-              <w:pStyle w:val="ImageCaption"/>
-            </w:pPr>
-            <w:r>
-              <w:t xml:space="preserve">Figura 7: QQ da GEV mensal: quantis teóricos versus observados, com ambos os eixos em escala log10. A diagonal representa igualdade; pontos muito abaixo dela indicam quantis teóricos excessivos.</w:t>
-            </w:r>
-          </w:p>
-          <w:bookmarkEnd w:id="67"/>
-        </w:tc>
-      </w:tr>
-    </w:tbl>
-    <w:p>
-      <w:pPr>
-        <w:pStyle w:val="BodyText"/>
-      </w:pPr>
-      <w:r>
-        <w:t xml:space="preserve">A região superior afasta-se fortemente da reta. Na posição empírica do maior ponto, o quantil teórico é 5.918e+00 W/m², contra 1.464e-03 W/m² observado. A GEV extrapola muito acima dos maiores fluxos desta amostra. O QQ cumpre a função diagnóstica que motiva a Figura 8 de Brito (s.d.), mas confronta diretamente a distribuição GEV ajustada, em vez de copiar a comparação com Gumbel ou classificar a cauda apenas pela curvatura.</w:t>
-      </w:r>
-    </w:p>
-    <w:tbl>
-      <w:tblPr>
-        <w:tblStyle w:val="Table"/>
-        <w:tblW w:type="pct" w:w="5000"/>
-        <w:tblLayout w:type="fixed"/>
-        <w:tblLook w:firstRow="0" w:lastRow="0" w:firstColumn="0" w:lastColumn="0" w:noHBand="0" w:noVBand="0" w:val="0000"/>
-      </w:tblPr>
-      <w:tblGrid>
-        <w:gridCol w:w="7920"/>
-      </w:tblGrid>
-      <w:tr>
-        <w:tc>
-          <w:tcPr/>
-          <w:bookmarkStart w:id="71" w:name="fig-pp-gev-principal"/>
+          <w:bookmarkStart w:id="71" w:name="fig-qq-gev-principal"/>
           <w:p>
             <w:pPr>
               <w:pStyle w:val="Compact"/>
@@ -3623,7 +3623,7 @@
                     <a:graphicData uri="http://schemas.openxmlformats.org/drawingml/2006/picture">
                       <pic:pic>
                         <pic:nvPicPr>
-                          <pic:cNvPr descr="figuras/pp_gev_mensal.png" id="70" name="Picture"/>
+                          <pic:cNvPr descr="figuras/qq_gev_mensal.png" id="70" name="Picture"/>
                           <pic:cNvPicPr>
                             <a:picLocks noChangeArrowheads="1" noChangeAspect="1"/>
                           </pic:cNvPicPr>
@@ -3666,7 +3666,7 @@
               <w:pStyle w:val="ImageCaption"/>
             </w:pPr>
             <w:r>
-              <w:t xml:space="preserve">Figura 8: PP da GEV mensal: probabilidades empíricas versus probabilidades do modelo. Proximidade da diagonal indica concordância global, sem validar isoladamente a cauda.</w:t>
+              <w:t xml:space="preserve">Figura 8: QQ da GEV mensal: quantis teóricos versus observados, com ambos os eixos em escala log10. A diagonal representa igualdade; pontos muito abaixo dela indicam quantis teóricos excessivos.</w:t>
             </w:r>
           </w:p>
           <w:bookmarkEnd w:id="71"/>
@@ -3678,38 +3678,7 @@
         <w:pStyle w:val="BodyText"/>
       </w:pPr>
       <w:r>
-        <w:t xml:space="preserve">O PP resume discrepâncias no conjunto da distribuição; seu RMSE é 0.0759. Mesmo um alinhamento razoável de parte dos pontos não compensa o desvio superior do QQ. Portanto,</w:t>
-      </w:r>
-      <w:r>
-        <w:t xml:space="preserve"> </w:t>
-      </w:r>
-      <w:r>
-        <w:rPr>
-          <w:b/>
-          <w:bCs/>
-        </w:rPr>
-        <w:t xml:space="preserve">convergência numérica não equivale a adequação estatística</w:t>
-      </w:r>
-      <w:r>
-        <w:t xml:space="preserve">.</w:t>
-      </w:r>
-    </w:p>
-    <w:bookmarkEnd w:id="72"/>
-    <w:bookmarkStart w:id="78" w:name="sec-retornos"/>
-    <w:p>
-      <w:pPr>
-        <w:pStyle w:val="Heading2"/>
-      </w:pPr>
-      <w:r>
-        <w:t xml:space="preserve">4.6 Níveis de retorno</w:t>
-      </w:r>
-    </w:p>
-    <w:p>
-      <w:pPr>
-        <w:pStyle w:val="FirstParagraph"/>
-      </w:pPr>
-      <w:r>
-        <w:t xml:space="preserve">Os níveis formais aumentam rapidamente com o período de retorno. São resultados da GEV ajustada e ajudam a avaliar suas consequências; os diagnósticos anteriores impedem tratá-los como previsões confiáveis.</w:t>
+        <w:t xml:space="preserve">A região superior afasta-se fortemente da reta. Na posição empírica do maior ponto, o quantil teórico é 5.918e+00 W/m², contra 1.464e-03 W/m² observado. A GEV extrapola muito acima dos maiores fluxos desta amostra. O QQ cumpre a função diagnóstica que motiva a Figura 8 de Brito (s.d.), mas confronta diretamente a distribuição GEV ajustada, em vez de copiar a comparação com Gumbel ou classificar a cauda apenas pela curvatura.</w:t>
       </w:r>
     </w:p>
     <w:tbl>
@@ -3725,7 +3694,125 @@
       <w:tr>
         <w:tc>
           <w:tcPr/>
-          <w:bookmarkStart w:id="73" w:name="tbl-retornos"/>
+          <w:bookmarkStart w:id="75" w:name="fig-pp-gev-principal"/>
+          <w:p>
+            <w:pPr>
+              <w:pStyle w:val="Compact"/>
+              <w:jc w:val="center"/>
+            </w:pPr>
+            <w:r>
+              <w:drawing>
+                <wp:inline>
+                  <wp:extent cx="5829300" cy="2975821"/>
+                  <wp:effectExtent b="0" l="0" r="0" t="0"/>
+                  <wp:docPr descr="" title="" id="73" name="Picture"/>
+                  <a:graphic>
+                    <a:graphicData uri="http://schemas.openxmlformats.org/drawingml/2006/picture">
+                      <pic:pic>
+                        <pic:nvPicPr>
+                          <pic:cNvPr descr="figuras/pp_gev_mensal.png" id="74" name="Picture"/>
+                          <pic:cNvPicPr>
+                            <a:picLocks noChangeArrowheads="1" noChangeAspect="1"/>
+                          </pic:cNvPicPr>
+                        </pic:nvPicPr>
+                        <pic:blipFill>
+                          <a:blip r:embed="rId72"/>
+                          <a:stretch>
+                            <a:fillRect/>
+                          </a:stretch>
+                        </pic:blipFill>
+                        <pic:spPr bwMode="auto">
+                          <a:xfrm>
+                            <a:off x="0" y="0"/>
+                            <a:ext cx="5829300" cy="2975821"/>
+                          </a:xfrm>
+                          <a:prstGeom prst="rect">
+                            <a:avLst/>
+                          </a:prstGeom>
+                          <a:noFill/>
+                          <a:ln w="9525">
+                            <a:noFill/>
+                            <a:headEnd/>
+                            <a:tailEnd/>
+                          </a:ln>
+                        </pic:spPr>
+                      </pic:pic>
+                    </a:graphicData>
+                  </a:graphic>
+                </wp:inline>
+              </w:drawing>
+            </w:r>
+          </w:p>
+          <w:p>
+            <w:pPr>
+              <w:jc w:val="center"/>
+            </w:pPr>
+            <w:pPr>
+              <w:jc w:val="start"/>
+              <w:spacing w:before="200"/>
+              <w:pStyle w:val="ImageCaption"/>
+            </w:pPr>
+            <w:r>
+              <w:t xml:space="preserve">Figura 9: PP da GEV mensal: probabilidades empíricas versus probabilidades do modelo. Proximidade da diagonal indica concordância global, sem validar isoladamente a cauda.</w:t>
+            </w:r>
+          </w:p>
+          <w:bookmarkEnd w:id="75"/>
+        </w:tc>
+      </w:tr>
+    </w:tbl>
+    <w:p>
+      <w:pPr>
+        <w:pStyle w:val="BodyText"/>
+      </w:pPr>
+      <w:r>
+        <w:t xml:space="preserve">O PP resume discrepâncias no conjunto da distribuição; seu RMSE é 0.0759. Mesmo um alinhamento razoável de parte dos pontos não compensa o desvio superior do QQ. Portanto,</w:t>
+      </w:r>
+      <w:r>
+        <w:t xml:space="preserve"> </w:t>
+      </w:r>
+      <w:r>
+        <w:rPr>
+          <w:b/>
+          <w:bCs/>
+        </w:rPr>
+        <w:t xml:space="preserve">convergência numérica não equivale a adequação estatística</w:t>
+      </w:r>
+      <w:r>
+        <w:t xml:space="preserve">.</w:t>
+      </w:r>
+    </w:p>
+    <w:bookmarkEnd w:id="76"/>
+    <w:bookmarkStart w:id="82" w:name="sec-retornos"/>
+    <w:p>
+      <w:pPr>
+        <w:pStyle w:val="Heading2"/>
+      </w:pPr>
+      <w:r>
+        <w:t xml:space="preserve">4.6 Níveis de retorno</w:t>
+      </w:r>
+    </w:p>
+    <w:p>
+      <w:pPr>
+        <w:pStyle w:val="FirstParagraph"/>
+      </w:pPr>
+      <w:r>
+        <w:t xml:space="preserve">Os níveis formais aumentam rapidamente com o período de retorno. São resultados da GEV ajustada e ajudam a avaliar suas consequências; os diagnósticos anteriores impedem tratá-los como previsões confiáveis.</w:t>
+      </w:r>
+    </w:p>
+    <w:tbl>
+      <w:tblPr>
+        <w:tblStyle w:val="Table"/>
+        <w:tblW w:type="pct" w:w="5000"/>
+        <w:tblLayout w:type="fixed"/>
+        <w:tblLook w:firstRow="0" w:lastRow="0" w:firstColumn="0" w:lastColumn="0" w:noHBand="0" w:noVBand="0" w:val="0000"/>
+      </w:tblPr>
+      <w:tblGrid>
+        <w:gridCol w:w="7920"/>
+      </w:tblGrid>
+      <w:tr>
+        <w:tc>
+          <w:tcPr/>
+          <w:bookmarkStart w:id="77" w:name="tbl-retornos"/>
           <w:p>
             <w:pPr>
               <w:jc w:val="center"/>
@@ -3970,7 +4057,7 @@
               </w:tc>
             </w:tr>
           </w:tbl>
-          <w:bookmarkEnd w:id="73"/>
+          <w:bookmarkEnd w:id="77"/>
           <w:p/>
         </w:tc>
       </w:tr>
@@ -4378,7 +4465,7 @@
       <w:tr>
         <w:tc>
           <w:tcPr/>
-          <w:bookmarkStart w:id="77" w:name="fig-retornos"/>
+          <w:bookmarkStart w:id="81" w:name="fig-retornos"/>
           <w:p>
             <w:pPr>
               <w:pStyle w:val="Compact"/>
@@ -4389,18 +4476,18 @@
                 <wp:inline>
                   <wp:extent cx="5829300" cy="2975821"/>
                   <wp:effectExtent b="0" l="0" r="0" t="0"/>
-                  <wp:docPr descr="" title="" id="75" name="Picture"/>
+                  <wp:docPr descr="" title="" id="79" name="Picture"/>
                   <a:graphic>
                     <a:graphicData uri="http://schemas.openxmlformats.org/drawingml/2006/picture">
                       <pic:pic>
                         <pic:nvPicPr>
-                          <pic:cNvPr descr="figuras/niveis_retorno.png" id="76" name="Picture"/>
+                          <pic:cNvPr descr="figuras/niveis_retorno.png" id="80" name="Picture"/>
                           <pic:cNvPicPr>
                             <a:picLocks noChangeArrowheads="1" noChangeAspect="1"/>
                           </pic:cNvPicPr>
                         </pic:nvPicPr>
                         <pic:blipFill>
-                          <a:blip r:embed="rId74"/>
+                          <a:blip r:embed="rId78"/>
                           <a:stretch>
                             <a:fillRect/>
                           </a:stretch>
@@ -4437,10 +4524,10 @@
               <w:pStyle w:val="ImageCaption"/>
             </w:pPr>
             <w:r>
-              <w:t xml:space="preserve">Figura 9: Nível de retorno versus período em anos, com ambos os eixos em log10. Linha: estimativa; faixa: IC bootstrap de 95%; pontos: máximos com posições empíricas até dez anos. Resultados condicionais à GEV histórica, cuja cauda está mal calibrada.</w:t>
+              <w:t xml:space="preserve">Figura 10: Nível de retorno versus período em anos, com ambos os eixos em log10. Linha: estimativa; faixa: IC bootstrap de 95%; pontos: máximos com posições empíricas até dez anos. Resultados condicionais à GEV histórica, cuja cauda está mal calibrada.</w:t>
             </w:r>
           </w:p>
-          <w:bookmarkEnd w:id="77"/>
+          <w:bookmarkEnd w:id="81"/>
         </w:tc>
       </w:tr>
     </w:tbl>
@@ -4452,8 +4539,8 @@
         <w:t xml:space="preserve">No gráfico, o eixo horizontal representa o período de retorno e o vertical, o fluxo. A linha corresponde aos quantis pontuais, a faixa aos IC bootstrap e os pontos aos máximos observados com posições empíricas. As escalas logarítmicas tornam visível o crescimento, mas não reduzem a distância entre as extrapolações e os dados. A curva e a tabela utilizam o mesmo ajuste e as mesmas replicações.</w:t>
       </w:r>
     </w:p>
-    <w:bookmarkEnd w:id="78"/>
-    <w:bookmarkStart w:id="84" w:name="Xb7c1256319cbb0e2f98c3b74fe90e9d50edd6ea"/>
+    <w:bookmarkEnd w:id="82"/>
+    <w:bookmarkStart w:id="88" w:name="Xb7c1256319cbb0e2f98c3b74fe90e9d50edd6ea"/>
     <w:p>
       <w:pPr>
         <w:pStyle w:val="Heading2"/>
@@ -4522,7 +4609,7 @@
       <w:tr>
         <w:tc>
           <w:tcPr/>
-          <w:bookmarkStart w:id="79" w:name="tbl-nao-estacionaria"/>
+          <w:bookmarkStart w:id="83" w:name="tbl-nao-estacionaria"/>
           <w:p>
             <w:pPr>
               <w:jc w:val="center"/>
@@ -4765,7 +4852,7 @@
               </w:tc>
             </w:tr>
           </w:tbl>
-          <w:bookmarkEnd w:id="79"/>
+          <w:bookmarkEnd w:id="83"/>
           <w:p/>
         </w:tc>
       </w:tr>
@@ -4791,7 +4878,7 @@
       <w:tr>
         <w:tc>
           <w:tcPr/>
-          <w:bookmarkStart w:id="83" w:name="fig-pit-tempo"/>
+          <w:bookmarkStart w:id="87" w:name="fig-pit-tempo"/>
           <w:p>
             <w:pPr>
               <w:pStyle w:val="Compact"/>
@@ -4802,18 +4889,18 @@
                 <wp:inline>
                   <wp:extent cx="5829300" cy="2975821"/>
                   <wp:effectExtent b="0" l="0" r="0" t="0"/>
-                  <wp:docPr descr="" title="" id="81" name="Picture"/>
+                  <wp:docPr descr="" title="" id="85" name="Picture"/>
                   <a:graphic>
                     <a:graphicData uri="http://schemas.openxmlformats.org/drawingml/2006/picture">
                       <pic:pic>
                         <pic:nvPicPr>
-                          <pic:cNvPr descr="figuras/pit_tempo.png" id="82" name="Picture"/>
+                          <pic:cNvPr descr="figuras/pit_tempo.png" id="86" name="Picture"/>
                           <pic:cNvPicPr>
                             <a:picLocks noChangeArrowheads="1" noChangeAspect="1"/>
                           </pic:cNvPicPr>
                         </pic:nvPicPr>
                         <pic:blipFill>
-                          <a:blip r:embed="rId80"/>
+                          <a:blip r:embed="rId84"/>
                           <a:stretch>
                             <a:fillRect/>
                           </a:stretch>
@@ -4850,10 +4937,10 @@
               <w:pStyle w:val="ImageCaption"/>
             </w:pPr>
             <w:r>
-              <w:t xml:space="preserve">Figura 10: Probabilidades acumuladas no tempo: GEV estacionária (pontos) e localização linear (linha). Uma transformação bem calibrada não deveria apresentar padrões temporais persistentes.</w:t>
+              <w:t xml:space="preserve">Figura 11: Probabilidades acumuladas no tempo: GEV estacionária (pontos) e localização linear (linha). Uma transformação bem calibrada não deveria apresentar padrões temporais persistentes.</w:t>
             </w:r>
           </w:p>
-          <w:bookmarkEnd w:id="83"/>
+          <w:bookmarkEnd w:id="87"/>
         </w:tc>
       </w:tr>
     </w:tbl>
@@ -4865,8 +4952,8 @@
         <w:t xml:space="preserve">A extensão não elimina o padrão temporal observado. Uma reta na localização é uma aproximação restritiva diante das diferenças entre anos e não representa necessariamente a dinâmica da atividade solar. O teste nominal também pressupõe regularidade e independência aproximadas; com dependência residual, sua interpretação é exploratória.</w:t>
       </w:r>
     </w:p>
-    <w:bookmarkEnd w:id="84"/>
-    <w:bookmarkStart w:id="85" w:name="síntese-dos-principais-resultados"/>
+    <w:bookmarkEnd w:id="88"/>
+    <w:bookmarkStart w:id="89" w:name="síntese-dos-principais-resultados"/>
     <w:p>
       <w:pPr>
         <w:pStyle w:val="Heading2"/>
@@ -4891,9 +4978,9 @@
         <w:t xml:space="preserve">A GEV convergiu e permitiu calcular quantis e intervalos. Contudo, o QQ, a forma elevada e a falta de excedências dos níveis formais revelaram má calibração na cauda superior. A extensão linear não solucionou essa limitação. A análise caracteriza os extremos observados, sem validar previsões de futuras erupções solares.</w:t>
       </w:r>
     </w:p>
-    <w:bookmarkEnd w:id="85"/>
-    <w:bookmarkEnd w:id="86"/>
-    <w:bookmarkStart w:id="87" w:name="discussão"/>
+    <w:bookmarkEnd w:id="89"/>
+    <w:bookmarkEnd w:id="90"/>
+    <w:bookmarkStart w:id="91" w:name="discussão"/>
     <w:p>
       <w:pPr>
         <w:pStyle w:val="Heading1"/>
@@ -4944,8 +5031,8 @@
         <w:t xml:space="preserve">Uma série mais longa e covariáveis externas poderiam apoiar investigações posteriores. Isso não permite atribuir mecanismos físicos aos padrões atuais: o estudo caracteriza o fluxo disponível e não identifica individualmente flares nem estabelece relações causais com a atividade solar.</w:t>
       </w:r>
     </w:p>
-    <w:bookmarkEnd w:id="87"/>
-    <w:bookmarkStart w:id="88" w:name="conclusão"/>
+    <w:bookmarkEnd w:id="91"/>
+    <w:bookmarkStart w:id="92" w:name="conclusão"/>
     <w:p>
       <w:pPr>
         <w:pStyle w:val="Heading1"/>
@@ -5012,8 +5099,8 @@
         <w:t xml:space="preserve">. Os níveis de retorno e seus intervalos são condicionais aos modelos e devem ser interpretados com cautela, sem apresentá-los como previsões de futuras erupções solares.</w:t>
       </w:r>
     </w:p>
-    <w:bookmarkEnd w:id="88"/>
-    <w:bookmarkStart w:id="89" w:name="referências"/>
+    <w:bookmarkEnd w:id="92"/>
+    <w:bookmarkStart w:id="93" w:name="referências"/>
     <w:p>
       <w:pPr>
         <w:pStyle w:val="Heading1"/>
@@ -5160,8 +5247,8 @@
         <w:t xml:space="preserve">.</w:t>
       </w:r>
     </w:p>
-    <w:bookmarkEnd w:id="89"/>
-    <w:bookmarkStart w:id="116" w:name="apêndice-informações-complementares"/>
+    <w:bookmarkEnd w:id="93"/>
+    <w:bookmarkStart w:id="120" w:name="apêndice-informações-complementares"/>
     <w:p>
       <w:pPr>
         <w:pStyle w:val="Heading1"/>
@@ -5190,7 +5277,7 @@
         <w:t xml:space="preserve">, inclusive quando apenas um resumo é apresentado aqui. Nenhuma análise ou observação foi removida do fluxo de cálculo para simplificar a exposição.</w:t>
       </w:r>
     </w:p>
-    <w:bookmarkStart w:id="93" w:name="ap-controle"/>
+    <w:bookmarkStart w:id="97" w:name="ap-controle"/>
     <w:p>
       <w:pPr>
         <w:pStyle w:val="Heading2"/>
@@ -5259,7 +5346,7 @@
       <w:tr>
         <w:tc>
           <w:tcPr/>
-          <w:bookmarkStart w:id="90" w:name="tbl-flags"/>
+          <w:bookmarkStart w:id="94" w:name="tbl-flags"/>
           <w:p>
             <w:pPr>
               <w:jc w:val="center"/>
@@ -5624,7 +5711,7 @@
               </w:tc>
             </w:tr>
           </w:tbl>
-          <w:bookmarkEnd w:id="90"/>
+          <w:bookmarkEnd w:id="94"/>
           <w:p/>
         </w:tc>
       </w:tr>
@@ -5665,7 +5752,7 @@
       <w:tr>
         <w:tc>
           <w:tcPr/>
-          <w:bookmarkStart w:id="91" w:name="tbl-qc"/>
+          <w:bookmarkStart w:id="95" w:name="tbl-qc"/>
           <w:p>
             <w:pPr>
               <w:jc w:val="center"/>
@@ -5788,7 +5875,7 @@
               </w:tc>
             </w:tr>
           </w:tbl>
-          <w:bookmarkEnd w:id="91"/>
+          <w:bookmarkEnd w:id="95"/>
           <w:p/>
         </w:tc>
       </w:tr>
@@ -5814,7 +5901,7 @@
       <w:tr>
         <w:tc>
           <w:tcPr/>
-          <w:bookmarkStart w:id="92" w:name="tbl-cobertura"/>
+          <w:bookmarkStart w:id="96" w:name="tbl-cobertura"/>
           <w:p>
             <w:pPr>
               <w:jc w:val="center"/>
@@ -6395,7 +6482,7 @@
               </w:tc>
             </w:tr>
           </w:tbl>
-          <w:bookmarkEnd w:id="92"/>
+          <w:bookmarkEnd w:id="96"/>
           <w:p/>
         </w:tc>
       </w:tr>
@@ -6428,8 +6515,8 @@
         <w:t xml:space="preserve">A leitura registrou avisos de conversão de atributos inteiros de 8 bytes para double (algorithm_version e input_files_total). Os valores lidos são pequenos e exatamente representáveis; tempo, fluxo e flags não foram alterados. Os avisos estão em tabelas/avisos_metadados.csv.</w:t>
       </w:r>
     </w:p>
-    <w:bookmarkEnd w:id="93"/>
-    <w:bookmarkStart w:id="101" w:name="ap-temporal"/>
+    <w:bookmarkEnd w:id="97"/>
+    <w:bookmarkStart w:id="105" w:name="ap-temporal"/>
     <w:p>
       <w:pPr>
         <w:pStyle w:val="Heading2"/>
@@ -6459,7 +6546,7 @@
       <w:tr>
         <w:tc>
           <w:tcPr/>
-          <w:bookmarkStart w:id="94" w:name="tbl-trechos"/>
+          <w:bookmarkStart w:id="98" w:name="tbl-trechos"/>
           <w:p>
             <w:pPr>
               <w:jc w:val="center"/>
@@ -6902,7 +6989,7 @@
               </w:tc>
             </w:tr>
           </w:tbl>
-          <w:bookmarkEnd w:id="94"/>
+          <w:bookmarkEnd w:id="98"/>
           <w:p/>
         </w:tc>
       </w:tr>
@@ -6928,7 +7015,7 @@
       <w:tr>
         <w:tc>
           <w:tcPr/>
-          <w:bookmarkStart w:id="95" w:name="tbl-ljung"/>
+          <w:bookmarkStart w:id="99" w:name="tbl-ljung"/>
           <w:p>
             <w:pPr>
               <w:jc w:val="center"/>
@@ -7371,7 +7458,7 @@
               </w:tc>
             </w:tr>
           </w:tbl>
-          <w:bookmarkEnd w:id="95"/>
+          <w:bookmarkEnd w:id="99"/>
           <w:p/>
         </w:tc>
       </w:tr>
@@ -7397,7 +7484,7 @@
       <w:tr>
         <w:tc>
           <w:tcPr/>
-          <w:bookmarkStart w:id="99" w:name="fig-dependencia-mensal"/>
+          <w:bookmarkStart w:id="103" w:name="fig-dependencia-mensal"/>
           <w:p>
             <w:pPr>
               <w:pStyle w:val="Compact"/>
@@ -7408,18 +7495,18 @@
                 <wp:inline>
                   <wp:extent cx="5829300" cy="2975821"/>
                   <wp:effectExtent b="0" l="0" r="0" t="0"/>
-                  <wp:docPr descr="" title="" id="97" name="Picture"/>
+                  <wp:docPr descr="" title="" id="101" name="Picture"/>
                   <a:graphic>
                     <a:graphicData uri="http://schemas.openxmlformats.org/drawingml/2006/picture">
                       <pic:pic>
                         <pic:nvPicPr>
-                          <pic:cNvPr descr="figuras/dependencia_maximos_mensal.png" id="98" name="Picture"/>
+                          <pic:cNvPr descr="figuras/dependencia_maximos_mensal.png" id="102" name="Picture"/>
                           <pic:cNvPicPr>
                             <a:picLocks noChangeArrowheads="1" noChangeAspect="1"/>
                           </pic:cNvPicPr>
                         </pic:nvPicPr>
                         <pic:blipFill>
-                          <a:blip r:embed="rId96"/>
+                          <a:blip r:embed="rId100"/>
                           <a:stretch>
                             <a:fillRect/>
                           </a:stretch>
@@ -7456,10 +7543,10 @@
               <w:pStyle w:val="ImageCaption"/>
             </w:pPr>
             <w:r>
-              <w:t xml:space="preserve">Figura 11: ACF e PACF de log10 dos máximos mensais no maior trecho contíguo. Bandas pontuais aproximadas sob ruído branco.</w:t>
+              <w:t xml:space="preserve">Figura 12: ACF e PACF de log10 dos máximos mensais no maior trecho contíguo. Bandas pontuais aproximadas sob ruído branco.</w:t>
             </w:r>
           </w:p>
-          <w:bookmarkEnd w:id="99"/>
+          <w:bookmarkEnd w:id="103"/>
         </w:tc>
       </w:tr>
     </w:tbl>
@@ -7513,7 +7600,7 @@
       <w:tr>
         <w:tc>
           <w:tcPr/>
-          <w:bookmarkStart w:id="100" w:name="tbl-parametros-ns"/>
+          <w:bookmarkStart w:id="104" w:name="tbl-parametros-ns"/>
           <w:p>
             <w:pPr>
               <w:jc w:val="center"/>
@@ -7956,7 +8043,7 @@
               </w:tc>
             </w:tr>
           </w:tbl>
-          <w:bookmarkEnd w:id="100"/>
+          <w:bookmarkEnd w:id="104"/>
           <w:p/>
         </w:tc>
       </w:tr>
@@ -7984,8 +8071,8 @@
         <w:t xml:space="preserve">mantém a escala numérica original. A diferença de AIC é preservada.</w:t>
       </w:r>
     </w:p>
-    <w:bookmarkEnd w:id="101"/>
-    <w:bookmarkStart w:id="105" w:name="incerteza-da-gev-e-calibração"/>
+    <w:bookmarkEnd w:id="105"/>
+    <w:bookmarkStart w:id="109" w:name="incerteza-da-gev-e-calibração"/>
     <w:p>
       <w:pPr>
         <w:pStyle w:val="Heading2"/>
@@ -8007,7 +8094,7 @@
       <w:tr>
         <w:tc>
           <w:tcPr/>
-          <w:bookmarkStart w:id="102" w:name="tbl-parametros-wald"/>
+          <w:bookmarkStart w:id="106" w:name="tbl-parametros-wald"/>
           <w:p>
             <w:pPr>
               <w:jc w:val="center"/>
@@ -8317,7 +8404,7 @@
               </w:tc>
             </w:tr>
           </w:tbl>
-          <w:bookmarkEnd w:id="102"/>
+          <w:bookmarkEnd w:id="106"/>
           <w:p/>
         </w:tc>
       </w:tr>
@@ -8356,7 +8443,7 @@
       <w:tr>
         <w:tc>
           <w:tcPr/>
-          <w:bookmarkStart w:id="103" w:name="tbl-calibracao-retornos"/>
+          <w:bookmarkStart w:id="107" w:name="tbl-calibracao-retornos"/>
           <w:p>
             <w:pPr>
               <w:jc w:val="center"/>
@@ -8601,7 +8688,7 @@
               </w:tc>
             </w:tr>
           </w:tbl>
-          <w:bookmarkEnd w:id="103"/>
+          <w:bookmarkEnd w:id="107"/>
           <w:p/>
         </w:tc>
       </w:tr>
@@ -8627,7 +8714,7 @@
       <w:tr>
         <w:tc>
           <w:tcPr/>
-          <w:bookmarkStart w:id="104" w:name="tbl-condicionais"/>
+          <w:bookmarkStart w:id="108" w:name="tbl-condicionais"/>
           <w:p>
             <w:pPr>
               <w:jc w:val="center"/>
@@ -9004,7 +9091,7 @@
               </w:tc>
             </w:tr>
           </w:tbl>
-          <w:bookmarkEnd w:id="104"/>
+          <w:bookmarkEnd w:id="108"/>
           <w:p/>
         </w:tc>
       </w:tr>
@@ -9017,8 +9104,8 @@
         <w:t xml:space="preserve">Esses quantis mantêm a covariável na data de referência; não representam uma trajetória futura de atividade solar. Seus intervalos delta não são a faixa bootstrap histórica e não incorporam dependência ou incerteza dessa trajetória.</w:t>
       </w:r>
     </w:p>
-    <w:bookmarkEnd w:id="105"/>
-    <w:bookmarkStart w:id="107" w:name="ap-sensibilidade"/>
+    <w:bookmarkEnd w:id="109"/>
+    <w:bookmarkStart w:id="111" w:name="ap-sensibilidade"/>
     <w:p>
       <w:pPr>
         <w:pStyle w:val="Heading2"/>
@@ -9048,7 +9135,7 @@
       <w:tr>
         <w:tc>
           <w:tcPr/>
-          <w:bookmarkStart w:id="106" w:name="tbl-sensibilidade-gev"/>
+          <w:bookmarkStart w:id="110" w:name="tbl-sensibilidade-gev"/>
           <w:p>
             <w:pPr>
               <w:jc w:val="center"/>
@@ -9571,7 +9658,7 @@
               </w:tc>
             </w:tr>
           </w:tbl>
-          <w:bookmarkEnd w:id="106"/>
+          <w:bookmarkEnd w:id="110"/>
           <w:p/>
         </w:tc>
       </w:tr>
@@ -9611,8 +9698,8 @@
         <w:t xml:space="preserve">.</w:t>
       </w:r>
     </w:p>
-    <w:bookmarkEnd w:id="107"/>
-    <w:bookmarkStart w:id="115" w:name="ap-reproducao"/>
+    <w:bookmarkEnd w:id="111"/>
+    <w:bookmarkStart w:id="119" w:name="ap-reproducao"/>
     <w:p>
       <w:pPr>
         <w:pStyle w:val="Heading2"/>
@@ -9748,7 +9835,7 @@
       <w:r>
         <w:t xml:space="preserve"> </w:t>
       </w:r>
-      <w:hyperlink r:id="rId108">
+      <w:hyperlink r:id="rId112">
         <w:r>
           <w:rPr>
             <w:rStyle w:val="Hyperlink"/>
@@ -9762,7 +9849,7 @@
       <w:r>
         <w:t xml:space="preserve"> </w:t>
       </w:r>
-      <w:hyperlink r:id="rId109">
+      <w:hyperlink r:id="rId113">
         <w:r>
           <w:rPr>
             <w:rStyle w:val="Hyperlink"/>
@@ -9830,7 +9917,7 @@
       <w:r>
         <w:t xml:space="preserve"> </w:t>
       </w:r>
-      <w:hyperlink r:id="rId110">
+      <w:hyperlink r:id="rId114">
         <w:r>
           <w:rPr>
             <w:rStyle w:val="Hyperlink"/>
@@ -9850,7 +9937,7 @@
       <w:r>
         <w:t xml:space="preserve"> </w:t>
       </w:r>
-      <w:hyperlink r:id="rId111">
+      <w:hyperlink r:id="rId115">
         <w:r>
           <w:rPr>
             <w:rStyle w:val="Hyperlink"/>
@@ -9903,7 +9990,7 @@
       <w:r>
         <w:t xml:space="preserve"> </w:t>
       </w:r>
-      <w:hyperlink r:id="rId112">
+      <w:hyperlink r:id="rId116">
         <w:r>
           <w:rPr>
             <w:rStyle w:val="Hyperlink"/>
@@ -9969,7 +10056,7 @@
       <w:r>
         <w:t xml:space="preserve"> </w:t>
       </w:r>
-      <w:hyperlink r:id="rId113">
+      <w:hyperlink r:id="rId117">
         <w:r>
           <w:rPr>
             <w:rStyle w:val="Hyperlink"/>
@@ -10030,7 +10117,7 @@
       <w:r>
         <w:t xml:space="preserve"> </w:t>
       </w:r>
-      <w:hyperlink r:id="rId114">
+      <w:hyperlink r:id="rId118">
         <w:r>
           <w:rPr>
             <w:rStyle w:val="Hyperlink"/>
@@ -10069,7 +10156,7 @@
       <w:r>
         <w:t xml:space="preserve"> </w:t>
       </w:r>
-      <w:hyperlink r:id="rId114">
+      <w:hyperlink r:id="rId118">
         <w:r>
           <w:rPr>
             <w:rStyle w:val="Hyperlink"/>
@@ -10395,8 +10482,8 @@
         <w:t xml:space="preserve">[33] tools_4.5.0       gtable_0.3.6     </w:t>
       </w:r>
     </w:p>
-    <w:bookmarkEnd w:id="115"/>
-    <w:bookmarkEnd w:id="116"/>
+    <w:bookmarkEnd w:id="119"/>
+    <w:bookmarkEnd w:id="120"/>
     <w:sectPr>
       <w:footerReference r:id="rId9" w:type="default"/>
       <w:footnotePr>

</xml_diff>

<commit_message>
Atualiza densidade mensal, remove PP gráfico e explicita excedências
</commit_message>
<xml_diff>
--- a/docs/relatorio.docx
+++ b/docs/relatorio.docx
@@ -1289,7 +1289,7 @@
       </w:r>
     </w:p>
     <w:bookmarkEnd w:id="29"/>
-    <w:bookmarkStart w:id="90" w:name="resultados"/>
+    <w:bookmarkStart w:id="86" w:name="resultados"/>
     <w:p>
       <w:pPr>
         <w:pStyle w:val="Heading1"/>
@@ -3078,7 +3078,7 @@
               <w:pStyle w:val="ImageCaption"/>
             </w:pPr>
             <w:r>
-              <w:t xml:space="preserve">Figura 7: Distribuição dos mesmos máximos mensais elegíveis utilizados na GEV principal, com o critério de cobertura já definido. Frequências em classes de largura igual pela regra de Sturges, na escala original do fluxo, sem exclusão dos maiores valores.</w:t>
+              <w:t xml:space="preserve">Figura 7: Distribuição dos mesmos máximos mensais elegíveis utilizados na GEV principal, com o critério de cobertura já definido. Histograma em densidade com classes de largura igual (Sturges) e KDE gaussiana com largura automática (nrd0), na escala original, sem exclusão dos maiores valores.</w:t>
             </w:r>
           </w:p>
           <w:bookmarkEnd w:id="65"/>
@@ -3090,11 +3090,25 @@
         <w:pStyle w:val="BodyText"/>
       </w:pPr>
       <w:r>
-        <w:t xml:space="preserve">Observa-se forte assimetria à direita na distribuição dos máximos mensais. A maior parte dos blocos apresenta máximos relativamente menores, enquanto poucos meses concentram valores substancialmente mais elevados, formando uma cauda superior pronunciada. Esse comportamento reforça o interesse em modelar especificamente os extremos por meio da distribuição GEV. Entretanto, a presença visual de uma cauda direita não implica, por si só, que uma GEV de cauda muito pesada forneça um ajuste adequado; essa questão é avaliada posteriormente pelos diagnósticos do modelo. O histograma e o ajuste GEV utilizam o fluxo na escala original, em W/m².</w:t>
+        <w:t xml:space="preserve">Na</w:t>
+      </w:r>
+      <w:r>
+        <w:t xml:space="preserve"> </w:t>
+      </w:r>
+      <w:hyperlink w:anchor="fig-histograma-mensal">
+        <w:r>
+          <w:rPr>
+            <w:rStyle w:val="Hyperlink"/>
+          </w:rPr>
+          <w:t xml:space="preserve">Figura 7</w:t>
+        </w:r>
+      </w:hyperlink>
+      <w:r>
+        <w:t xml:space="preserve">, o histograma e a curva de densidade kernel estimada evidenciam forte assimetria à direita nos máximos mensais. A maior parte dos blocos apresenta máximos relativamente menores, enquanto poucos meses concentram valores substancialmente mais elevados, formando uma cauda superior pronunciada. Esse comportamento reforça o interesse em modelar especificamente os extremos por meio da distribuição GEV. Entretanto, a presença visual de uma cauda direita não implica, por si só, que uma GEV de cauda muito pesada forneça um ajuste adequado; essa questão é avaliada posteriormente pelos diagnósticos do modelo. O histograma, a densidade e o ajuste GEV utilizam o fluxo na escala original, em W/m². A curva é uma estimativa não paramétrica, não uma evidência de domínio Fréchet. O kernel gaussiano pode apresentar viés junto ao limite inferior positivo; a curva é desenhada apenas no intervalo observado e não define limites físicos do fluxo.</w:t>
       </w:r>
     </w:p>
     <w:bookmarkEnd w:id="66"/>
-    <w:bookmarkStart w:id="76" w:name="ajuste-da-gev"/>
+    <w:bookmarkStart w:id="72" w:name="ajuste-da-gev"/>
     <w:p>
       <w:pPr>
         <w:pStyle w:val="Heading2"/>
@@ -3681,6 +3695,24 @@
         <w:t xml:space="preserve">A região superior afasta-se fortemente da reta. Na posição empírica do maior ponto, o quantil teórico é 5.918e+00 W/m², contra 1.464e-03 W/m² observado. A GEV extrapola muito acima dos maiores fluxos desta amostra. O QQ cumpre a função diagnóstica que motiva a Figura 8 de Brito (s.d.), mas confronta diretamente a distribuição GEV ajustada, em vez de copiar a comparação com Gumbel ou classificar a cauda apenas pela curvatura.</w:t>
       </w:r>
     </w:p>
+    <w:bookmarkEnd w:id="72"/>
+    <w:bookmarkStart w:id="78" w:name="sec-retornos"/>
+    <w:p>
+      <w:pPr>
+        <w:pStyle w:val="Heading2"/>
+      </w:pPr>
+      <w:r>
+        <w:t xml:space="preserve">4.6 Níveis de retorno</w:t>
+      </w:r>
+    </w:p>
+    <w:p>
+      <w:pPr>
+        <w:pStyle w:val="FirstParagraph"/>
+      </w:pPr>
+      <w:r>
+        <w:t xml:space="preserve">Os níveis formais aumentam rapidamente com o período de retorno. São resultados da GEV ajustada e ajudam a avaliar suas consequências; os diagnósticos anteriores impedem tratá-los como previsões confiáveis.</w:t>
+      </w:r>
+    </w:p>
     <w:tbl>
       <w:tblPr>
         <w:tblStyle w:val="Table"/>
@@ -3694,7 +3726,859 @@
       <w:tr>
         <w:tc>
           <w:tcPr/>
-          <w:bookmarkStart w:id="75" w:name="fig-pp-gev-principal"/>
+          <w:bookmarkStart w:id="73" w:name="tbl-retornos"/>
+          <w:p>
+            <w:pPr>
+              <w:jc w:val="center"/>
+            </w:pPr>
+            <w:pPr>
+              <w:jc w:val="start"/>
+              <w:spacing w:before="200"/>
+              <w:pStyle w:val="ImageCaption"/>
+            </w:pPr>
+            <w:r>
+              <w:t xml:space="preserve">Tabela 4: Níveis de retorno do fluxo solar XRS-B estimados pela GEV, com intervalos de confiança de 95%.</w:t>
+            </w:r>
+          </w:p>
+          <w:p>
+            <w:pPr>
+              <w:pStyle w:val="Compact"/>
+              <w:jc w:val="center"/>
+            </w:pPr>
+            <w:r>
+              <w:t xml:space="preserve">Níveis de retorno do fluxo solar XRS-B estimados pela GEV, com intervalos de confiança de 95%.</w:t>
+            </w:r>
+          </w:p>
+          <w:tbl>
+            <w:tblPr>
+              <w:tblStyle w:val="Table"/>
+              <w:tblW w:type="pct" w:w="5000"/>
+              <w:tblLayout w:type="fixed"/>
+              <w:tblLook w:firstRow="1" w:lastRow="0" w:firstColumn="0" w:lastColumn="0" w:noHBand="0" w:noVBand="0" w:val="0020"/>
+              <w:tblCaption w:val="Níveis de retorno do fluxo solar XRS-B estimados pela GEV, com intervalos de confiança de 95%."/>
+            </w:tblPr>
+            <w:tblGrid>
+              <w:gridCol w:w="1195"/>
+              <w:gridCol w:w="1643"/>
+              <w:gridCol w:w="1643"/>
+              <w:gridCol w:w="3436"/>
+            </w:tblGrid>
+            <w:tr>
+              <w:trPr>
+                <w:tblHeader w:val="on"/>
+              </w:trPr>
+              <w:tc>
+                <w:tcPr/>
+                <w:p>
+                  <w:pPr>
+                    <w:pStyle w:val="Compact"/>
+                    <w:jc w:val="left"/>
+                    <w:jc w:val="center"/>
+                  </w:pPr>
+                  <w:r>
+                    <w:t xml:space="preserve">Período de retorno</w:t>
+                  </w:r>
+                </w:p>
+              </w:tc>
+              <w:tc>
+                <w:tcPr/>
+                <w:p>
+                  <w:pPr>
+                    <w:pStyle w:val="Compact"/>
+                    <w:jc w:val="left"/>
+                    <w:jc w:val="center"/>
+                  </w:pPr>
+                  <w:r>
+                    <w:t xml:space="preserve">Prob. de excedência mensal</w:t>
+                  </w:r>
+                </w:p>
+              </w:tc>
+              <w:tc>
+                <w:tcPr/>
+                <w:p>
+                  <w:pPr>
+                    <w:pStyle w:val="Compact"/>
+                    <w:jc w:val="left"/>
+                    <w:jc w:val="center"/>
+                  </w:pPr>
+                  <w:r>
+                    <w:t xml:space="preserve">Estimativa (W/m²)</w:t>
+                  </w:r>
+                </w:p>
+              </w:tc>
+              <w:tc>
+                <w:tcPr/>
+                <w:p>
+                  <w:pPr>
+                    <w:pStyle w:val="Compact"/>
+                    <w:jc w:val="left"/>
+                    <w:jc w:val="center"/>
+                  </w:pPr>
+                  <w:r>
+                    <w:t xml:space="preserve">IC 95% (W/m²)</w:t>
+                  </w:r>
+                </w:p>
+              </w:tc>
+            </w:tr>
+            <w:tr>
+              <w:tc>
+                <w:tcPr/>
+                <w:p>
+                  <w:pPr>
+                    <w:pStyle w:val="Compact"/>
+                    <w:jc w:val="left"/>
+                    <w:jc w:val="center"/>
+                  </w:pPr>
+                  <w:r>
+                    <w:t xml:space="preserve">1 ano</w:t>
+                  </w:r>
+                </w:p>
+              </w:tc>
+              <w:tc>
+                <w:tcPr/>
+                <w:p>
+                  <w:pPr>
+                    <w:pStyle w:val="Compact"/>
+                    <w:jc w:val="left"/>
+                    <w:jc w:val="center"/>
+                  </w:pPr>
+                  <w:r>
+                    <w:t xml:space="preserve">8,33%</w:t>
+                  </w:r>
+                </w:p>
+              </w:tc>
+              <w:tc>
+                <w:tcPr/>
+                <w:p>
+                  <w:pPr>
+                    <w:pStyle w:val="Compact"/>
+                    <w:jc w:val="left"/>
+                    <w:jc w:val="center"/>
+                  </w:pPr>
+                  <w:r>
+                    <w:t xml:space="preserve">2,576e-03</w:t>
+                  </w:r>
+                </w:p>
+              </w:tc>
+              <w:tc>
+                <w:tcPr/>
+                <w:p>
+                  <w:pPr>
+                    <w:pStyle w:val="Compact"/>
+                    <w:jc w:val="left"/>
+                    <w:jc w:val="center"/>
+                  </w:pPr>
+                  <w:r>
+                    <w:t xml:space="preserve">(4,208e-04; 9,815e-03)</w:t>
+                  </w:r>
+                </w:p>
+              </w:tc>
+            </w:tr>
+            <w:tr>
+              <w:tc>
+                <w:tcPr/>
+                <w:p>
+                  <w:pPr>
+                    <w:pStyle w:val="Compact"/>
+                    <w:jc w:val="left"/>
+                    <w:jc w:val="center"/>
+                  </w:pPr>
+                  <w:r>
+                    <w:t xml:space="preserve">2 anos</w:t>
+                  </w:r>
+                </w:p>
+              </w:tc>
+              <w:tc>
+                <w:tcPr/>
+                <w:p>
+                  <w:pPr>
+                    <w:pStyle w:val="Compact"/>
+                    <w:jc w:val="left"/>
+                    <w:jc w:val="center"/>
+                  </w:pPr>
+                  <w:r>
+                    <w:t xml:space="preserve">4,17%</w:t>
+                  </w:r>
+                </w:p>
+              </w:tc>
+              <w:tc>
+                <w:tcPr/>
+                <w:p>
+                  <w:pPr>
+                    <w:pStyle w:val="Compact"/>
+                    <w:jc w:val="left"/>
+                    <w:jc w:val="center"/>
+                  </w:pPr>
+                  <w:r>
+                    <w:t xml:space="preserve">1,870e-02</w:t>
+                  </w:r>
+                </w:p>
+              </w:tc>
+              <w:tc>
+                <w:tcPr/>
+                <w:p>
+                  <w:pPr>
+                    <w:pStyle w:val="Compact"/>
+                    <w:jc w:val="left"/>
+                    <w:jc w:val="center"/>
+                  </w:pPr>
+                  <w:r>
+                    <w:t xml:space="preserve">(1,222e-03; 1,019e-01)</w:t>
+                  </w:r>
+                </w:p>
+              </w:tc>
+            </w:tr>
+            <w:tr>
+              <w:tc>
+                <w:tcPr/>
+                <w:p>
+                  <w:pPr>
+                    <w:pStyle w:val="Compact"/>
+                    <w:jc w:val="left"/>
+                    <w:jc w:val="center"/>
+                  </w:pPr>
+                  <w:r>
+                    <w:t xml:space="preserve">5 anos</w:t>
+                  </w:r>
+                </w:p>
+              </w:tc>
+              <w:tc>
+                <w:tcPr/>
+                <w:p>
+                  <w:pPr>
+                    <w:pStyle w:val="Compact"/>
+                    <w:jc w:val="left"/>
+                    <w:jc w:val="center"/>
+                  </w:pPr>
+                  <w:r>
+                    <w:t xml:space="preserve">1,67%</w:t>
+                  </w:r>
+                </w:p>
+              </w:tc>
+              <w:tc>
+                <w:tcPr/>
+                <w:p>
+                  <w:pPr>
+                    <w:pStyle w:val="Compact"/>
+                    <w:jc w:val="left"/>
+                    <w:jc w:val="center"/>
+                  </w:pPr>
+                  <w:r>
+                    <w:t xml:space="preserve">2,457e-01</w:t>
+                  </w:r>
+                </w:p>
+              </w:tc>
+              <w:tc>
+                <w:tcPr/>
+                <w:p>
+                  <w:pPr>
+                    <w:pStyle w:val="Compact"/>
+                    <w:jc w:val="left"/>
+                    <w:jc w:val="center"/>
+                  </w:pPr>
+                  <w:r>
+                    <w:t xml:space="preserve">(4,057e-03; 2,556e+00)</w:t>
+                  </w:r>
+                </w:p>
+              </w:tc>
+            </w:tr>
+            <w:tr>
+              <w:tc>
+                <w:tcPr/>
+                <w:p>
+                  <w:pPr>
+                    <w:pStyle w:val="Compact"/>
+                    <w:jc w:val="left"/>
+                    <w:jc w:val="center"/>
+                  </w:pPr>
+                  <w:r>
+                    <w:t xml:space="preserve">10 anos</w:t>
+                  </w:r>
+                </w:p>
+              </w:tc>
+              <w:tc>
+                <w:tcPr/>
+                <w:p>
+                  <w:pPr>
+                    <w:pStyle w:val="Compact"/>
+                    <w:jc w:val="left"/>
+                    <w:jc w:val="center"/>
+                  </w:pPr>
+                  <w:r>
+                    <w:t xml:space="preserve">0,83%</w:t>
+                  </w:r>
+                </w:p>
+              </w:tc>
+              <w:tc>
+                <w:tcPr/>
+                <w:p>
+                  <w:pPr>
+                    <w:pStyle w:val="Compact"/>
+                    <w:jc w:val="left"/>
+                    <w:jc w:val="center"/>
+                  </w:pPr>
+                  <w:r>
+                    <w:t xml:space="preserve">1,698e+00</w:t>
+                  </w:r>
+                </w:p>
+              </w:tc>
+              <w:tc>
+                <w:tcPr/>
+                <w:p>
+                  <w:pPr>
+                    <w:pStyle w:val="Compact"/>
+                    <w:jc w:val="left"/>
+                    <w:jc w:val="center"/>
+                  </w:pPr>
+                  <w:r>
+                    <w:t xml:space="preserve">(9,712e-03; 2,651e+01)</w:t>
+                  </w:r>
+                </w:p>
+              </w:tc>
+            </w:tr>
+          </w:tbl>
+          <w:bookmarkEnd w:id="73"/>
+          <w:p/>
+        </w:tc>
+      </w:tr>
+    </w:tbl>
+    <w:p>
+      <w:pPr>
+        <w:pStyle w:val="BodyText"/>
+      </w:pPr>
+      <w:r>
+        <w:t xml:space="preserve">A</w:t>
+      </w:r>
+      <w:r>
+        <w:t xml:space="preserve"> </w:t>
+      </w:r>
+      <w:hyperlink w:anchor="tbl-retornos">
+        <w:r>
+          <w:rPr>
+            <w:rStyle w:val="Hyperlink"/>
+          </w:rPr>
+          <w:t xml:space="preserve">Tabela 4</w:t>
+        </w:r>
+      </w:hyperlink>
+      <w:r>
+        <w:t xml:space="preserve"> </w:t>
+      </w:r>
+      <w:r>
+        <w:t xml:space="preserve">apresenta as estimativas pontuais dos níveis de retorno do fluxo solar XRS-B e seus intervalos de confiança de 95%, para os horizontes de 1, 2, 5, 10 anos. Os valores são quantis da GEV ajustada aos</w:t>
+      </w:r>
+      <w:r>
+        <w:t xml:space="preserve"> </w:t>
+      </w:r>
+      <w:r>
+        <w:rPr>
+          <w:b/>
+          <w:bCs/>
+        </w:rPr>
+        <w:t xml:space="preserve">94 máximos mensais elegíveis</w:t>
+      </w:r>
+      <w:r>
+        <w:t xml:space="preserve">, não à totalidade dos minutos individuais. A coluna</w:t>
+      </w:r>
+      <w:r>
+        <w:t xml:space="preserve"> </w:t>
+      </w:r>
+      <w:r>
+        <w:t xml:space="preserve">“Prob. de excedência mensal”</w:t>
+      </w:r>
+      <w:r>
+        <w:t xml:space="preserve"> </w:t>
+      </w:r>
+      <w:r>
+        <w:t xml:space="preserve">informa a probabilidade de ultrapassagem em um mês segundo o modelo; a coluna seguinte apresenta o nível estimado, e a última reúne os limites inferior e superior, nessa ordem, ambos em W/m². Os intervalos principais vêm do bootstrap circular de blocos móveis, mantendo a grade mensal e suas lacunas.</w:t>
+      </w:r>
+    </w:p>
+    <w:p>
+      <w:pPr>
+        <w:pStyle w:val="BodyText"/>
+      </w:pPr>
+      <w:r>
+        <w:t xml:space="preserve">Nesta aplicação, cada ano corresponde a 12 blocos mensais. Assim, os horizontes da tabela equivalem a 12, 24, 60, 120 blocos, respectivamente. O período de retorno expressa uma</w:t>
+      </w:r>
+      <w:r>
+        <w:t xml:space="preserve"> </w:t>
+      </w:r>
+      <w:r>
+        <w:rPr>
+          <w:b/>
+          <w:bCs/>
+        </w:rPr>
+        <w:t xml:space="preserve">probabilidade de excedência por mês</w:t>
+      </w:r>
+      <w:r>
+        <w:t xml:space="preserve">: para um horizonte de</w:t>
+      </w:r>
+      <w:r>
+        <w:t xml:space="preserve"> </w:t>
+      </w:r>
+      <m:oMath>
+        <m:r>
+          <m:t>T</m:t>
+        </m:r>
+      </m:oMath>
+      <w:r>
+        <w:t xml:space="preserve"> </w:t>
+      </w:r>
+      <w:r>
+        <w:t xml:space="preserve">anos, ela é</w:t>
+      </w:r>
+      <w:r>
+        <w:t xml:space="preserve"> </w:t>
+      </w:r>
+      <m:oMath>
+        <m:sSub>
+          <m:e>
+            <m:r>
+              <m:t>p</m:t>
+            </m:r>
+          </m:e>
+          <m:sub>
+            <m:r>
+              <m:t>T</m:t>
+            </m:r>
+          </m:sub>
+        </m:sSub>
+        <m:r>
+          <m:rPr>
+            <m:sty m:val="p"/>
+          </m:rPr>
+          <m:t>=</m:t>
+        </m:r>
+        <m:r>
+          <m:t>1</m:t>
+        </m:r>
+        <m:r>
+          <m:rPr>
+            <m:sty m:val="p"/>
+          </m:rPr>
+          <m:t>/</m:t>
+        </m:r>
+        <m:d>
+          <m:dPr>
+            <m:begChr m:val="("/>
+            <m:sepChr m:val=""/>
+            <m:endChr m:val=")"/>
+            <m:grow/>
+          </m:dPr>
+          <m:e>
+            <m:r>
+              <m:t>12</m:t>
+            </m:r>
+            <m:r>
+              <m:t>T</m:t>
+            </m:r>
+          </m:e>
+        </m:d>
+      </m:oMath>
+      <w:r>
+        <w:t xml:space="preserve">, calculada na nova coluna da</w:t>
+      </w:r>
+      <w:r>
+        <w:t xml:space="preserve"> </w:t>
+      </w:r>
+      <w:hyperlink w:anchor="tbl-retornos">
+        <w:r>
+          <w:rPr>
+            <w:rStyle w:val="Hyperlink"/>
+          </w:rPr>
+          <w:t xml:space="preserve">Tabela 4</w:t>
+        </w:r>
+      </w:hyperlink>
+      <w:r>
+        <w:t xml:space="preserve">. Para 1 ano, temos</w:t>
+      </w:r>
+      <w:r>
+        <w:t xml:space="preserve"> </w:t>
+      </w:r>
+      <m:oMath>
+        <m:r>
+          <m:t>1</m:t>
+        </m:r>
+        <m:r>
+          <m:rPr>
+            <m:sty m:val="p"/>
+          </m:rPr>
+          <m:t>/</m:t>
+        </m:r>
+        <m:r>
+          <m:t>12</m:t>
+        </m:r>
+        <m:r>
+          <m:rPr>
+            <m:sty m:val="p"/>
+          </m:rPr>
+          <m:t>=</m:t>
+        </m:r>
+        <m:r>
+          <m:t>0</m:t>
+        </m:r>
+        <m:r>
+          <m:rPr>
+            <m:sty m:val="p"/>
+          </m:rPr>
+          <m:t>,</m:t>
+        </m:r>
+        <m:r>
+          <m:t>0833</m:t>
+        </m:r>
+      </m:oMath>
+      <w:r>
+        <w:t xml:space="preserve">, ou aproximadamente 8,33%; para 10 anos,</w:t>
+      </w:r>
+      <w:r>
+        <w:t xml:space="preserve"> </w:t>
+      </w:r>
+      <m:oMath>
+        <m:r>
+          <m:t>1</m:t>
+        </m:r>
+        <m:r>
+          <m:rPr>
+            <m:sty m:val="p"/>
+          </m:rPr>
+          <m:t>/</m:t>
+        </m:r>
+        <m:r>
+          <m:t>120</m:t>
+        </m:r>
+        <m:r>
+          <m:rPr>
+            <m:sty m:val="p"/>
+          </m:rPr>
+          <m:t>=</m:t>
+        </m:r>
+        <m:r>
+          <m:t>0</m:t>
+        </m:r>
+        <m:r>
+          <m:rPr>
+            <m:sty m:val="p"/>
+          </m:rPr>
+          <m:t>,</m:t>
+        </m:r>
+        <m:r>
+          <m:t>00833</m:t>
+        </m:r>
+      </m:oMath>
+      <w:r>
+        <w:t xml:space="preserve">, aproximadamente 0,83%. Um período de retorno de um ano</w:t>
+      </w:r>
+      <w:r>
+        <w:t xml:space="preserve"> </w:t>
+      </w:r>
+      <w:r>
+        <w:rPr>
+          <w:b/>
+          <w:bCs/>
+        </w:rPr>
+        <w:t xml:space="preserve">não significa que o evento necessariamente ocorrerá uma vez por ano</w:t>
+      </w:r>
+      <w:r>
+        <w:t xml:space="preserve">. Apenas sob estabilidade da distribuição e independência aproximada a espera média teria a interpretação de</w:t>
+      </w:r>
+      <w:r>
+        <w:t xml:space="preserve"> </w:t>
+      </w:r>
+      <m:oMath>
+        <m:r>
+          <m:t>12</m:t>
+        </m:r>
+        <m:r>
+          <m:t>T</m:t>
+        </m:r>
+      </m:oMath>
+      <w:r>
+        <w:t xml:space="preserve"> </w:t>
+      </w:r>
+      <w:r>
+        <w:t xml:space="preserve">meses. Isso não estabelece uma data para a ocorrência: meses com excedências podem se agrupar, e um intervalo de duração</w:t>
+      </w:r>
+      <w:r>
+        <w:t xml:space="preserve"> </w:t>
+      </w:r>
+      <m:oMath>
+        <m:r>
+          <m:t>T</m:t>
+        </m:r>
+      </m:oMath>
+      <w:r>
+        <w:t xml:space="preserve"> </w:t>
+      </w:r>
+      <w:r>
+        <w:t xml:space="preserve">também pode transcorrer sem nenhuma. A dependência e a heterogeneidade observadas nesta base limitam essa leitura como tempo de espera.</w:t>
+      </w:r>
+    </w:p>
+    <w:p>
+      <w:pPr>
+        <w:pStyle w:val="BodyText"/>
+      </w:pPr>
+      <w:r>
+        <w:t xml:space="preserve">Para o horizonte mais curto, de</w:t>
+      </w:r>
+      <w:r>
+        <w:t xml:space="preserve"> </w:t>
+      </w:r>
+      <w:r>
+        <w:rPr>
+          <w:b/>
+          <w:bCs/>
+        </w:rPr>
+        <w:t xml:space="preserve">1 ano</w:t>
+      </w:r>
+      <w:r>
+        <w:t xml:space="preserve">, o modelo fornece</w:t>
+      </w:r>
+      <w:r>
+        <w:t xml:space="preserve"> </w:t>
+      </w:r>
+      <w:r>
+        <w:rPr>
+          <w:b/>
+          <w:bCs/>
+        </w:rPr>
+        <w:t xml:space="preserve">2,576e-03 W/m²</w:t>
+      </w:r>
+      <w:r>
+        <w:t xml:space="preserve">, com IC 95% de 4,208e-04 a 9,815e-03 W/m². Esse nível corresponde, segundo a GEV estimada, a uma probabilidade mensal de ultrapassagem de aproximadamente</w:t>
+      </w:r>
+      <w:r>
+        <w:t xml:space="preserve"> </w:t>
+      </w:r>
+      <w:r>
+        <w:rPr>
+          <w:b/>
+          <w:bCs/>
+        </w:rPr>
+        <w:t xml:space="preserve">8,33%</w:t>
+      </w:r>
+      <w:r>
+        <w:t xml:space="preserve">. Trata-se de identificar qual intensidade ocupa essa posição extrema da distribuição ajustada; não de afirmar que tal intensidade será atingida ao completar um ano. O intervalo acompanha a incerteza da estimação desse quantil, não a duração até um próximo episódio.</w:t>
+      </w:r>
+    </w:p>
+    <w:p>
+      <w:pPr>
+        <w:pStyle w:val="BodyText"/>
+      </w:pPr>
+      <w:r>
+        <w:t xml:space="preserve">No horizonte mais longo, de</w:t>
+      </w:r>
+      <w:r>
+        <w:t xml:space="preserve"> </w:t>
+      </w:r>
+      <w:r>
+        <w:rPr>
+          <w:b/>
+          <w:bCs/>
+        </w:rPr>
+        <w:t xml:space="preserve">10 anos</w:t>
+      </w:r>
+      <w:r>
+        <w:t xml:space="preserve">, a estimativa é</w:t>
+      </w:r>
+      <w:r>
+        <w:t xml:space="preserve"> </w:t>
+      </w:r>
+      <w:r>
+        <w:rPr>
+          <w:b/>
+          <w:bCs/>
+        </w:rPr>
+        <w:t xml:space="preserve">1,698e+00 W/m²</w:t>
+      </w:r>
+      <w:r>
+        <w:t xml:space="preserve">, com IC 95% de 9,712e-03 a 2,651e+01 W/m². A probabilidade de excedência atribuída pelo modelo é de aproximadamente</w:t>
+      </w:r>
+      <w:r>
+        <w:t xml:space="preserve"> </w:t>
+      </w:r>
+      <w:r>
+        <w:rPr>
+          <w:b/>
+          <w:bCs/>
+        </w:rPr>
+        <w:t xml:space="preserve">0,83% por mês</w:t>
+      </w:r>
+      <w:r>
+        <w:t xml:space="preserve">, correspondente a um quantil mais extremo. Esse horizonte já ultrapassa a duração da série observada, de modo que sua interpretação depende fortemente da extrapolação da cauda, e não da observação repetida de eventos com essa magnitude. A tabela, por si só, não comprova que o processo solar produza tais intensidades com essa frequência.</w:t>
+      </w:r>
+    </w:p>
+    <w:p>
+      <w:pPr>
+        <w:pStyle w:val="BodyText"/>
+      </w:pPr>
+      <w:r>
+        <w:t xml:space="preserve">A comparação entre os extremos da tabela mostra um crescimento muito acentuado: o nível de 10 anos é cerca de</w:t>
+      </w:r>
+      <w:r>
+        <w:t xml:space="preserve"> </w:t>
+      </w:r>
+      <w:r>
+        <w:rPr>
+          <w:b/>
+          <w:bCs/>
+        </w:rPr>
+        <w:t xml:space="preserve">659,1 vezes</w:t>
+      </w:r>
+      <w:r>
+        <w:t xml:space="preserve"> </w:t>
+      </w:r>
+      <w:r>
+        <w:t xml:space="preserve">o de 1 ano. A amplitude do IC, calculada como limite superior menos inferior, passa de</w:t>
+      </w:r>
+      <w:r>
+        <w:t xml:space="preserve"> </w:t>
+      </w:r>
+      <w:r>
+        <w:rPr>
+          <w:b/>
+          <w:bCs/>
+        </w:rPr>
+        <w:t xml:space="preserve">9,394e-03 W/m²</w:t>
+      </w:r>
+      <w:r>
+        <w:t xml:space="preserve"> </w:t>
+      </w:r>
+      <w:r>
+        <w:t xml:space="preserve">para</w:t>
+      </w:r>
+      <w:r>
+        <w:t xml:space="preserve"> </w:t>
+      </w:r>
+      <w:r>
+        <w:rPr>
+          <w:b/>
+          <w:bCs/>
+        </w:rPr>
+        <w:t xml:space="preserve">2,650e+01 W/m²</w:t>
+      </w:r>
+      <w:r>
+        <w:t xml:space="preserve">. Portanto, nesta tabela a incerteza aumenta também em escala absoluta. O rápido crescimento dos quantis é coerente com a forma estimada elevada,</w:t>
+      </w:r>
+      <w:r>
+        <w:t xml:space="preserve"> </w:t>
+      </w:r>
+      <m:oMath>
+        <m:acc>
+          <m:accPr>
+            <m:chr m:val="̂"/>
+          </m:accPr>
+          <m:e>
+            <m:r>
+              <m:t>ξ</m:t>
+            </m:r>
+          </m:e>
+        </m:acc>
+        <m:r>
+          <m:rPr>
+            <m:sty m:val="p"/>
+          </m:rPr>
+          <m:t>=</m:t>
+        </m:r>
+      </m:oMath>
+      <w:r>
+        <w:t xml:space="preserve"> </w:t>
+      </w:r>
+      <w:r>
+        <w:t xml:space="preserve">2,772, mas revela uma consequência da cauda do modelo agregado, não uma lei física estabelecida para o Sol.</w:t>
+      </w:r>
+    </w:p>
+    <w:p>
+      <w:pPr>
+        <w:pStyle w:val="BodyText"/>
+      </w:pPr>
+      <w:r>
+        <w:t xml:space="preserve">Os IC de 95% resumem a variação das estimativas nas</w:t>
+      </w:r>
+      <w:r>
+        <w:t xml:space="preserve"> </w:t>
+      </w:r>
+      <w:r>
+        <w:rPr>
+          <w:b/>
+          <w:bCs/>
+        </w:rPr>
+        <w:t xml:space="preserve">399 replicações válidas</w:t>
+      </w:r>
+      <w:r>
+        <w:t xml:space="preserve"> </w:t>
+      </w:r>
+      <w:r>
+        <w:t xml:space="preserve">do bootstrap, que reamostra segmentos de 5 meses. Se as hipóteses do modelo e da reamostragem fossem adequadas, cerca de 95% dos intervalos construídos em muitas repetições hipotéticas do estudo conteriam o nível de retorno populacional correspondente. Esse é o sentido frequentista de cobertura de 95%. Não se atribui uma probabilidade de 95% ao parâmetro fixo estar neste intervalo específico, nem se afirma que 95% dos fluxos observados estejam entre os limites. Nos horizontes longos há menos informação empírica sobre a região da cauda considerada, o que ajuda a compreender os intervalos mais amplos. Como o ajuste apresenta limitações, a cobertura aqui é nominal: o bootstrap preserva parte da dependência local, mas não corrige a má especificação ou toda a mudança temporal.</w:t>
+      </w:r>
+    </w:p>
+    <w:p>
+      <w:pPr>
+        <w:pStyle w:val="BodyText"/>
+      </w:pPr>
+      <w:r>
+        <w:t xml:space="preserve">Em termos do objeto estudado, os níveis representam intensidades extremas do fluxo de raios X registrado pelo canal XRS-B, calculadas a partir de médias de um minuto. Um fluxo maior indica maior intensidade registrada nesse canal, sem identificar automaticamente uma erupção física ou atribuir-lhe uma classe operacional. A comparação com a própria amostra evidencia a dificuldade do ajuste: o nível formal de 1 ano já equivale a</w:t>
+      </w:r>
+      <w:r>
+        <w:t xml:space="preserve"> </w:t>
+      </w:r>
+      <w:r>
+        <w:rPr>
+          <w:b/>
+          <w:bCs/>
+        </w:rPr>
+        <w:t xml:space="preserve">1,76 vezes o maior fluxo observado</w:t>
+      </w:r>
+      <w:r>
+        <w:t xml:space="preserve">. Ele teve 0 excedências, embora a GEV constante esperasse cerca de 7,8 entre os máximos elegíveis. Para 10 anos, a estimativa alcança cerca de 1.159,6 vezes o máximo observado. A distância não deve ser confundida com evidência de eventos solares dessa magnitude.</w:t>
+      </w:r>
+    </w:p>
+    <w:p>
+      <w:pPr>
+        <w:pStyle w:val="BodyText"/>
+      </w:pPr>
+      <w:r>
+        <w:t xml:space="preserve">Esses contrastes precisam ser lidos em conjunto com os diagnósticos anteriores: a</w:t>
+      </w:r>
+      <w:r>
+        <w:t xml:space="preserve"> </w:t>
+      </w:r>
+      <w:r>
+        <w:rPr>
+          <w:b/>
+          <w:bCs/>
+        </w:rPr>
+        <w:t xml:space="preserve">GEV estacionária global produz uma cauda superior excessivamente pesada em relação aos máximos observados</w:t>
+      </w:r>
+      <w:r>
+        <w:t xml:space="preserve">. Os níveis são úteis para explicitar as consequências matemáticas desse ajuste, mas seu crescimento e seus IC não validam a extrapolação. Os níveis de 5 e 10 anos também ultrapassam o limite valid_max declarado no produto (2,000e-01 W/m²), o que exige ressalva instrumental; esse limite não é uma barreira física demonstrada para o Sol. Assim, especialmente nos horizontes longos, a tabela apresenta</w:t>
+      </w:r>
+      <w:r>
+        <w:t xml:space="preserve"> </w:t>
+      </w:r>
+      <w:r>
+        <w:rPr>
+          <w:b/>
+          <w:bCs/>
+        </w:rPr>
+        <w:t xml:space="preserve">resultados formais e condicionais ao modelo, não previsões operacionais confiáveis da intensidade de eventos solares futuros</w:t>
+      </w:r>
+      <w:r>
+        <w:t xml:space="preserve">.</w:t>
+      </w:r>
+    </w:p>
+    <w:tbl>
+      <w:tblPr>
+        <w:tblStyle w:val="Table"/>
+        <w:tblW w:type="pct" w:w="5000"/>
+        <w:tblLayout w:type="fixed"/>
+        <w:tblLook w:firstRow="0" w:lastRow="0" w:firstColumn="0" w:lastColumn="0" w:noHBand="0" w:noVBand="0" w:val="0000"/>
+      </w:tblPr>
+      <w:tblGrid>
+        <w:gridCol w:w="7920"/>
+      </w:tblGrid>
+      <w:tr>
+        <w:tc>
+          <w:tcPr/>
+          <w:bookmarkStart w:id="77" w:name="fig-retornos"/>
           <w:p>
             <w:pPr>
               <w:pStyle w:val="Compact"/>
@@ -3705,18 +4589,18 @@
                 <wp:inline>
                   <wp:extent cx="5829300" cy="2975821"/>
                   <wp:effectExtent b="0" l="0" r="0" t="0"/>
-                  <wp:docPr descr="" title="" id="73" name="Picture"/>
+                  <wp:docPr descr="" title="" id="75" name="Picture"/>
                   <a:graphic>
                     <a:graphicData uri="http://schemas.openxmlformats.org/drawingml/2006/picture">
                       <pic:pic>
                         <pic:nvPicPr>
-                          <pic:cNvPr descr="figuras/pp_gev_mensal.png" id="74" name="Picture"/>
+                          <pic:cNvPr descr="figuras/niveis_retorno.png" id="76" name="Picture"/>
                           <pic:cNvPicPr>
                             <a:picLocks noChangeArrowheads="1" noChangeAspect="1"/>
                           </pic:cNvPicPr>
                         </pic:nvPicPr>
                         <pic:blipFill>
-                          <a:blip r:embed="rId72"/>
+                          <a:blip r:embed="rId74"/>
                           <a:stretch>
                             <a:fillRect/>
                           </a:stretch>
@@ -3753,10 +4637,10 @@
               <w:pStyle w:val="ImageCaption"/>
             </w:pPr>
             <w:r>
-              <w:t xml:space="preserve">Figura 9: PP da GEV mensal: probabilidades empíricas versus probabilidades do modelo. Proximidade da diagonal indica concordância global, sem validar isoladamente a cauda.</w:t>
+              <w:t xml:space="preserve">Figura 9: Nível de retorno versus período em anos, com ambos os eixos em log10. Linha: estimativa; faixa: IC bootstrap de 95%; pontos: máximos com posições empíricas até dez anos. Resultados condicionais à GEV histórica, cuja cauda está mal calibrada.</w:t>
             </w:r>
           </w:p>
-          <w:bookmarkEnd w:id="75"/>
+          <w:bookmarkEnd w:id="77"/>
         </w:tc>
       </w:tr>
     </w:tbl>
@@ -3765,38 +4649,64 @@
         <w:pStyle w:val="BodyText"/>
       </w:pPr>
       <w:r>
-        <w:t xml:space="preserve">O PP resume discrepâncias no conjunto da distribuição; seu RMSE é 0.0759. Mesmo um alinhamento razoável de parte dos pontos não compensa o desvio superior do QQ. Portanto,</w:t>
-      </w:r>
-      <w:r>
-        <w:t xml:space="preserve"> </w:t>
-      </w:r>
-      <w:r>
-        <w:rPr>
-          <w:b/>
-          <w:bCs/>
-        </w:rPr>
-        <w:t xml:space="preserve">convergência numérica não equivale a adequação estatística</w:t>
-      </w:r>
+        <w:t xml:space="preserve">No gráfico, o eixo horizontal representa o período de retorno e o vertical, o fluxo. A linha corresponde aos quantis pontuais, a faixa aos IC bootstrap e os pontos aos máximos observados com posições empíricas. As escalas logarítmicas tornam visível o crescimento, mas não reduzem a distância entre as extrapolações e os dados. A curva e a tabela utilizam o mesmo ajuste e as mesmas replicações.</w:t>
+      </w:r>
+    </w:p>
+    <w:bookmarkEnd w:id="78"/>
+    <w:bookmarkStart w:id="84" w:name="Xb7c1256319cbb0e2f98c3b74fe90e9d50edd6ea"/>
+    <w:p>
+      <w:pPr>
+        <w:pStyle w:val="Heading2"/>
+      </w:pPr>
+      <w:r>
+        <w:t xml:space="preserve">4.7 Estacionariedade e comportamento temporal</w:t>
+      </w:r>
+    </w:p>
+    <w:p>
+      <w:pPr>
+        <w:pStyle w:val="FirstParagraph"/>
+      </w:pPr>
+      <w:r>
+        <w:t xml:space="preserve">Há dependência residual: a correlação de pares mensais adjacentes foi 0.795, em 91 pares. No PIT da GEV (probabilidade acumulada atribuída a cada máximo), o Ljung–Box no maior trecho contíguo apresentou valor p &lt; 0,001. Esses resultados e a variação anual desaconselham tratar os meses automaticamente como independentes e identicamente distribuídos. Recortes, autocorrelações e lags estão no</w:t>
+      </w:r>
+      <w:r>
+        <w:t xml:space="preserve"> </w:t>
+      </w:r>
+      <w:hyperlink w:anchor="ap-temporal">
+        <w:r>
+          <w:rPr>
+            <w:rStyle w:val="Hyperlink"/>
+          </w:rPr>
+          <w:t xml:space="preserve">Apêndice: dependência e comparação temporal</w:t>
+        </w:r>
+      </w:hyperlink>
       <w:r>
         <w:t xml:space="preserve">.</w:t>
       </w:r>
     </w:p>
-    <w:bookmarkEnd w:id="76"/>
-    <w:bookmarkStart w:id="82" w:name="sec-retornos"/>
-    <w:p>
-      <w:pPr>
-        <w:pStyle w:val="Heading2"/>
-      </w:pPr>
-      <w:r>
-        <w:t xml:space="preserve">4.6 Níveis de retorno</w:t>
-      </w:r>
-    </w:p>
-    <w:p>
-      <w:pPr>
-        <w:pStyle w:val="FirstParagraph"/>
-      </w:pPr>
-      <w:r>
-        <w:t xml:space="preserve">Os níveis formais aumentam rapidamente com o período de retorno. São resultados da GEV ajustada e ajudam a avaliar suas consequências; os diagnósticos anteriores impedem tratá-los como previsões confiáveis.</w:t>
+    <w:p>
+      <w:pPr>
+        <w:pStyle w:val="BodyText"/>
+      </w:pPr>
+      <w:r>
+        <w:t xml:space="preserve">A extensão linear acrescenta uma possível mudança na localização, mantendo escala e forma constantes. A</w:t>
+      </w:r>
+      <w:r>
+        <w:t xml:space="preserve"> </w:t>
+      </w:r>
+      <w:hyperlink w:anchor="tbl-nao-estacionaria">
+        <w:r>
+          <w:rPr>
+            <w:rStyle w:val="Hyperlink"/>
+          </w:rPr>
+          <w:t xml:space="preserve">Tabela 5</w:t>
+        </w:r>
+      </w:hyperlink>
+      <w:r>
+        <w:t xml:space="preserve"> </w:t>
+      </w:r>
+      <w:r>
+        <w:t xml:space="preserve">compara os mesmos máximos e apresenta os critérios na unidade original W/m².</w:t>
       </w:r>
     </w:p>
     <w:tbl>
@@ -3812,804 +4722,7 @@
       <w:tr>
         <w:tc>
           <w:tcPr/>
-          <w:bookmarkStart w:id="77" w:name="tbl-retornos"/>
-          <w:p>
-            <w:pPr>
-              <w:jc w:val="center"/>
-            </w:pPr>
-            <w:pPr>
-              <w:jc w:val="start"/>
-              <w:spacing w:before="200"/>
-              <w:pStyle w:val="ImageCaption"/>
-            </w:pPr>
-            <w:r>
-              <w:t xml:space="preserve">Tabela 4: Níveis de retorno do fluxo solar XRS-B estimados pela GEV, com intervalos de confiança de 95%.</w:t>
-            </w:r>
-          </w:p>
-          <w:p>
-            <w:pPr>
-              <w:pStyle w:val="Compact"/>
-              <w:jc w:val="center"/>
-            </w:pPr>
-            <w:r>
-              <w:t xml:space="preserve">Níveis de retorno do fluxo solar XRS-B estimados pela GEV, com intervalos de confiança de 95%.</w:t>
-            </w:r>
-          </w:p>
-          <w:tbl>
-            <w:tblPr>
-              <w:tblStyle w:val="Table"/>
-              <w:tblW w:type="pct" w:w="5000"/>
-              <w:tblLayout w:type="fixed"/>
-              <w:tblLook w:firstRow="1" w:lastRow="0" w:firstColumn="0" w:lastColumn="0" w:noHBand="0" w:noVBand="0" w:val="0020"/>
-              <w:tblCaption w:val="Níveis de retorno do fluxo solar XRS-B estimados pela GEV, com intervalos de confiança de 95%."/>
-            </w:tblPr>
-            <w:tblGrid>
-              <w:gridCol w:w="1508"/>
-              <w:gridCol w:w="2074"/>
-              <w:gridCol w:w="4337"/>
-            </w:tblGrid>
-            <w:tr>
-              <w:trPr>
-                <w:tblHeader w:val="on"/>
-              </w:trPr>
-              <w:tc>
-                <w:tcPr/>
-                <w:p>
-                  <w:pPr>
-                    <w:pStyle w:val="Compact"/>
-                    <w:jc w:val="left"/>
-                    <w:jc w:val="center"/>
-                  </w:pPr>
-                  <w:r>
-                    <w:t xml:space="preserve">Período de retorno</w:t>
-                  </w:r>
-                </w:p>
-              </w:tc>
-              <w:tc>
-                <w:tcPr/>
-                <w:p>
-                  <w:pPr>
-                    <w:pStyle w:val="Compact"/>
-                    <w:jc w:val="left"/>
-                    <w:jc w:val="center"/>
-                  </w:pPr>
-                  <w:r>
-                    <w:t xml:space="preserve">Estimativa (W/m²)</w:t>
-                  </w:r>
-                </w:p>
-              </w:tc>
-              <w:tc>
-                <w:tcPr/>
-                <w:p>
-                  <w:pPr>
-                    <w:pStyle w:val="Compact"/>
-                    <w:jc w:val="left"/>
-                    <w:jc w:val="center"/>
-                  </w:pPr>
-                  <w:r>
-                    <w:t xml:space="preserve">IC 95% (W/m²)</w:t>
-                  </w:r>
-                </w:p>
-              </w:tc>
-            </w:tr>
-            <w:tr>
-              <w:tc>
-                <w:tcPr/>
-                <w:p>
-                  <w:pPr>
-                    <w:pStyle w:val="Compact"/>
-                    <w:jc w:val="left"/>
-                    <w:jc w:val="center"/>
-                  </w:pPr>
-                  <w:r>
-                    <w:t xml:space="preserve">1 ano</w:t>
-                  </w:r>
-                </w:p>
-              </w:tc>
-              <w:tc>
-                <w:tcPr/>
-                <w:p>
-                  <w:pPr>
-                    <w:pStyle w:val="Compact"/>
-                    <w:jc w:val="left"/>
-                    <w:jc w:val="center"/>
-                  </w:pPr>
-                  <w:r>
-                    <w:t xml:space="preserve">2,576e-03</w:t>
-                  </w:r>
-                </w:p>
-              </w:tc>
-              <w:tc>
-                <w:tcPr/>
-                <w:p>
-                  <w:pPr>
-                    <w:pStyle w:val="Compact"/>
-                    <w:jc w:val="left"/>
-                    <w:jc w:val="center"/>
-                  </w:pPr>
-                  <w:r>
-                    <w:t xml:space="preserve">(4,208e-04; 9,815e-03)</w:t>
-                  </w:r>
-                </w:p>
-              </w:tc>
-            </w:tr>
-            <w:tr>
-              <w:tc>
-                <w:tcPr/>
-                <w:p>
-                  <w:pPr>
-                    <w:pStyle w:val="Compact"/>
-                    <w:jc w:val="left"/>
-                    <w:jc w:val="center"/>
-                  </w:pPr>
-                  <w:r>
-                    <w:t xml:space="preserve">2 anos</w:t>
-                  </w:r>
-                </w:p>
-              </w:tc>
-              <w:tc>
-                <w:tcPr/>
-                <w:p>
-                  <w:pPr>
-                    <w:pStyle w:val="Compact"/>
-                    <w:jc w:val="left"/>
-                    <w:jc w:val="center"/>
-                  </w:pPr>
-                  <w:r>
-                    <w:t xml:space="preserve">1,870e-02</w:t>
-                  </w:r>
-                </w:p>
-              </w:tc>
-              <w:tc>
-                <w:tcPr/>
-                <w:p>
-                  <w:pPr>
-                    <w:pStyle w:val="Compact"/>
-                    <w:jc w:val="left"/>
-                    <w:jc w:val="center"/>
-                  </w:pPr>
-                  <w:r>
-                    <w:t xml:space="preserve">(1,222e-03; 1,019e-01)</w:t>
-                  </w:r>
-                </w:p>
-              </w:tc>
-            </w:tr>
-            <w:tr>
-              <w:tc>
-                <w:tcPr/>
-                <w:p>
-                  <w:pPr>
-                    <w:pStyle w:val="Compact"/>
-                    <w:jc w:val="left"/>
-                    <w:jc w:val="center"/>
-                  </w:pPr>
-                  <w:r>
-                    <w:t xml:space="preserve">5 anos</w:t>
-                  </w:r>
-                </w:p>
-              </w:tc>
-              <w:tc>
-                <w:tcPr/>
-                <w:p>
-                  <w:pPr>
-                    <w:pStyle w:val="Compact"/>
-                    <w:jc w:val="left"/>
-                    <w:jc w:val="center"/>
-                  </w:pPr>
-                  <w:r>
-                    <w:t xml:space="preserve">2,457e-01</w:t>
-                  </w:r>
-                </w:p>
-              </w:tc>
-              <w:tc>
-                <w:tcPr/>
-                <w:p>
-                  <w:pPr>
-                    <w:pStyle w:val="Compact"/>
-                    <w:jc w:val="left"/>
-                    <w:jc w:val="center"/>
-                  </w:pPr>
-                  <w:r>
-                    <w:t xml:space="preserve">(4,057e-03; 2,556e+00)</w:t>
-                  </w:r>
-                </w:p>
-              </w:tc>
-            </w:tr>
-            <w:tr>
-              <w:tc>
-                <w:tcPr/>
-                <w:p>
-                  <w:pPr>
-                    <w:pStyle w:val="Compact"/>
-                    <w:jc w:val="left"/>
-                    <w:jc w:val="center"/>
-                  </w:pPr>
-                  <w:r>
-                    <w:t xml:space="preserve">10 anos</w:t>
-                  </w:r>
-                </w:p>
-              </w:tc>
-              <w:tc>
-                <w:tcPr/>
-                <w:p>
-                  <w:pPr>
-                    <w:pStyle w:val="Compact"/>
-                    <w:jc w:val="left"/>
-                    <w:jc w:val="center"/>
-                  </w:pPr>
-                  <w:r>
-                    <w:t xml:space="preserve">1,698e+00</w:t>
-                  </w:r>
-                </w:p>
-              </w:tc>
-              <w:tc>
-                <w:tcPr/>
-                <w:p>
-                  <w:pPr>
-                    <w:pStyle w:val="Compact"/>
-                    <w:jc w:val="left"/>
-                    <w:jc w:val="center"/>
-                  </w:pPr>
-                  <w:r>
-                    <w:t xml:space="preserve">(9,712e-03; 2,651e+01)</w:t>
-                  </w:r>
-                </w:p>
-              </w:tc>
-            </w:tr>
-          </w:tbl>
-          <w:bookmarkEnd w:id="77"/>
-          <w:p/>
-        </w:tc>
-      </w:tr>
-    </w:tbl>
-    <w:p>
-      <w:pPr>
-        <w:pStyle w:val="BodyText"/>
-      </w:pPr>
-      <w:r>
-        <w:t xml:space="preserve">A</w:t>
-      </w:r>
-      <w:r>
-        <w:t xml:space="preserve"> </w:t>
-      </w:r>
-      <w:hyperlink w:anchor="tbl-retornos">
-        <w:r>
-          <w:rPr>
-            <w:rStyle w:val="Hyperlink"/>
-          </w:rPr>
-          <w:t xml:space="preserve">Tabela 4</w:t>
-        </w:r>
-      </w:hyperlink>
-      <w:r>
-        <w:t xml:space="preserve"> </w:t>
-      </w:r>
-      <w:r>
-        <w:t xml:space="preserve">apresenta as estimativas pontuais dos níveis de retorno do fluxo solar XRS-B e seus intervalos de confiança de 95%, para os horizontes de 1, 2, 5, 10 anos. Os valores são quantis da GEV ajustada aos</w:t>
-      </w:r>
-      <w:r>
-        <w:t xml:space="preserve"> </w:t>
-      </w:r>
-      <w:r>
-        <w:rPr>
-          <w:b/>
-          <w:bCs/>
-        </w:rPr>
-        <w:t xml:space="preserve">94 máximos mensais elegíveis</w:t>
-      </w:r>
-      <w:r>
-        <w:t xml:space="preserve">, não à totalidade dos minutos individuais. A coluna central informa o nível estimado, e a última reúne os limites inferior e superior, nessa ordem, ambos em W/m². Os intervalos principais vêm do bootstrap circular de blocos móveis, mantendo a grade mensal e suas lacunas.</w:t>
-      </w:r>
-    </w:p>
-    <w:p>
-      <w:pPr>
-        <w:pStyle w:val="BodyText"/>
-      </w:pPr>
-      <w:r>
-        <w:t xml:space="preserve">Nesta aplicação, cada ano corresponde a 12 blocos mensais. Assim, os horizontes da tabela equivalem a 12, 24, 60, 120 blocos, respectivamente. O período de retorno expressa uma</w:t>
-      </w:r>
-      <w:r>
-        <w:t xml:space="preserve"> </w:t>
-      </w:r>
-      <w:r>
-        <w:rPr>
-          <w:b/>
-          <w:bCs/>
-        </w:rPr>
-        <w:t xml:space="preserve">probabilidade de excedência por mês</w:t>
-      </w:r>
-      <w:r>
-        <w:t xml:space="preserve">: para um horizonte de</w:t>
-      </w:r>
-      <w:r>
-        <w:t xml:space="preserve"> </w:t>
-      </w:r>
-      <m:oMath>
-        <m:r>
-          <m:t>T</m:t>
-        </m:r>
-      </m:oMath>
-      <w:r>
-        <w:t xml:space="preserve"> </w:t>
-      </w:r>
-      <w:r>
-        <w:t xml:space="preserve">anos, ela é</w:t>
-      </w:r>
-      <w:r>
-        <w:t xml:space="preserve"> </w:t>
-      </w:r>
-      <m:oMath>
-        <m:r>
-          <m:t>1</m:t>
-        </m:r>
-        <m:r>
-          <m:rPr>
-            <m:sty m:val="p"/>
-          </m:rPr>
-          <m:t>/</m:t>
-        </m:r>
-        <m:d>
-          <m:dPr>
-            <m:begChr m:val="("/>
-            <m:sepChr m:val=""/>
-            <m:endChr m:val=")"/>
-            <m:grow/>
-          </m:dPr>
-          <m:e>
-            <m:r>
-              <m:t>12</m:t>
-            </m:r>
-            <m:r>
-              <m:t>T</m:t>
-            </m:r>
-          </m:e>
-        </m:d>
-      </m:oMath>
-      <w:r>
-        <w:t xml:space="preserve">. Apenas sob estabilidade da distribuição e independência aproximada a espera média teria a interpretação de</w:t>
-      </w:r>
-      <w:r>
-        <w:t xml:space="preserve"> </w:t>
-      </w:r>
-      <m:oMath>
-        <m:r>
-          <m:t>12</m:t>
-        </m:r>
-        <m:r>
-          <m:t>T</m:t>
-        </m:r>
-      </m:oMath>
-      <w:r>
-        <w:t xml:space="preserve"> </w:t>
-      </w:r>
-      <w:r>
-        <w:t xml:space="preserve">meses. Isso não estabelece uma data para a ocorrência: meses com excedências podem se agrupar, e um intervalo de duração</w:t>
-      </w:r>
-      <w:r>
-        <w:t xml:space="preserve"> </w:t>
-      </w:r>
-      <m:oMath>
-        <m:r>
-          <m:t>T</m:t>
-        </m:r>
-      </m:oMath>
-      <w:r>
-        <w:t xml:space="preserve"> </w:t>
-      </w:r>
-      <w:r>
-        <w:t xml:space="preserve">também pode transcorrer sem nenhuma. A dependência e a heterogeneidade observadas nesta base limitam essa leitura como tempo de espera.</w:t>
-      </w:r>
-    </w:p>
-    <w:p>
-      <w:pPr>
-        <w:pStyle w:val="BodyText"/>
-      </w:pPr>
-      <w:r>
-        <w:t xml:space="preserve">Para o horizonte mais curto, de</w:t>
-      </w:r>
-      <w:r>
-        <w:t xml:space="preserve"> </w:t>
-      </w:r>
-      <w:r>
-        <w:rPr>
-          <w:b/>
-          <w:bCs/>
-        </w:rPr>
-        <w:t xml:space="preserve">1 ano</w:t>
-      </w:r>
-      <w:r>
-        <w:t xml:space="preserve">, o modelo fornece</w:t>
-      </w:r>
-      <w:r>
-        <w:t xml:space="preserve"> </w:t>
-      </w:r>
-      <w:r>
-        <w:rPr>
-          <w:b/>
-          <w:bCs/>
-        </w:rPr>
-        <w:t xml:space="preserve">2,576e-03 W/m²</w:t>
-      </w:r>
-      <w:r>
-        <w:t xml:space="preserve">, com IC 95% de 4,208e-04 a 9,815e-03 W/m². Esse nível corresponde, segundo a GEV estimada, a uma probabilidade mensal de ultrapassagem de aproximadamente</w:t>
-      </w:r>
-      <w:r>
-        <w:t xml:space="preserve"> </w:t>
-      </w:r>
-      <w:r>
-        <w:rPr>
-          <w:b/>
-          <w:bCs/>
-        </w:rPr>
-        <w:t xml:space="preserve">8,33%</w:t>
-      </w:r>
-      <w:r>
-        <w:t xml:space="preserve">. Trata-se de identificar qual intensidade ocupa essa posição extrema da distribuição ajustada; não de afirmar que tal intensidade será atingida ao completar um ano. O intervalo acompanha a incerteza da estimação desse quantil, não a duração até um próximo episódio.</w:t>
-      </w:r>
-    </w:p>
-    <w:p>
-      <w:pPr>
-        <w:pStyle w:val="BodyText"/>
-      </w:pPr>
-      <w:r>
-        <w:t xml:space="preserve">No horizonte mais longo, de</w:t>
-      </w:r>
-      <w:r>
-        <w:t xml:space="preserve"> </w:t>
-      </w:r>
-      <w:r>
-        <w:rPr>
-          <w:b/>
-          <w:bCs/>
-        </w:rPr>
-        <w:t xml:space="preserve">10 anos</w:t>
-      </w:r>
-      <w:r>
-        <w:t xml:space="preserve">, a estimativa é</w:t>
-      </w:r>
-      <w:r>
-        <w:t xml:space="preserve"> </w:t>
-      </w:r>
-      <w:r>
-        <w:rPr>
-          <w:b/>
-          <w:bCs/>
-        </w:rPr>
-        <w:t xml:space="preserve">1,698e+00 W/m²</w:t>
-      </w:r>
-      <w:r>
-        <w:t xml:space="preserve">, com IC 95% de 9,712e-03 a 2,651e+01 W/m². A probabilidade de excedência atribuída pelo modelo é de aproximadamente</w:t>
-      </w:r>
-      <w:r>
-        <w:t xml:space="preserve"> </w:t>
-      </w:r>
-      <w:r>
-        <w:rPr>
-          <w:b/>
-          <w:bCs/>
-        </w:rPr>
-        <w:t xml:space="preserve">0,83% por mês</w:t>
-      </w:r>
-      <w:r>
-        <w:t xml:space="preserve">, correspondente a um quantil mais extremo. Esse horizonte já ultrapassa a duração da série observada, de modo que sua interpretação depende fortemente da extrapolação da cauda, e não da observação repetida de eventos com essa magnitude. A tabela, por si só, não comprova que o processo solar produza tais intensidades com essa frequência.</w:t>
-      </w:r>
-    </w:p>
-    <w:p>
-      <w:pPr>
-        <w:pStyle w:val="BodyText"/>
-      </w:pPr>
-      <w:r>
-        <w:t xml:space="preserve">A comparação entre os extremos da tabela mostra um crescimento muito acentuado: o nível de 10 anos é cerca de</w:t>
-      </w:r>
-      <w:r>
-        <w:t xml:space="preserve"> </w:t>
-      </w:r>
-      <w:r>
-        <w:rPr>
-          <w:b/>
-          <w:bCs/>
-        </w:rPr>
-        <w:t xml:space="preserve">659,1 vezes</w:t>
-      </w:r>
-      <w:r>
-        <w:t xml:space="preserve"> </w:t>
-      </w:r>
-      <w:r>
-        <w:t xml:space="preserve">o de 1 ano. A amplitude do IC, calculada como limite superior menos inferior, passa de</w:t>
-      </w:r>
-      <w:r>
-        <w:t xml:space="preserve"> </w:t>
-      </w:r>
-      <w:r>
-        <w:rPr>
-          <w:b/>
-          <w:bCs/>
-        </w:rPr>
-        <w:t xml:space="preserve">9,394e-03 W/m²</w:t>
-      </w:r>
-      <w:r>
-        <w:t xml:space="preserve"> </w:t>
-      </w:r>
-      <w:r>
-        <w:t xml:space="preserve">para</w:t>
-      </w:r>
-      <w:r>
-        <w:t xml:space="preserve"> </w:t>
-      </w:r>
-      <w:r>
-        <w:rPr>
-          <w:b/>
-          <w:bCs/>
-        </w:rPr>
-        <w:t xml:space="preserve">2,650e+01 W/m²</w:t>
-      </w:r>
-      <w:r>
-        <w:t xml:space="preserve">. Portanto, nesta tabela a incerteza aumenta também em escala absoluta. O rápido crescimento dos quantis é coerente com a forma estimada elevada,</w:t>
-      </w:r>
-      <w:r>
-        <w:t xml:space="preserve"> </w:t>
-      </w:r>
-      <m:oMath>
-        <m:acc>
-          <m:accPr>
-            <m:chr m:val="̂"/>
-          </m:accPr>
-          <m:e>
-            <m:r>
-              <m:t>ξ</m:t>
-            </m:r>
-          </m:e>
-        </m:acc>
-        <m:r>
-          <m:rPr>
-            <m:sty m:val="p"/>
-          </m:rPr>
-          <m:t>=</m:t>
-        </m:r>
-      </m:oMath>
-      <w:r>
-        <w:t xml:space="preserve"> </w:t>
-      </w:r>
-      <w:r>
-        <w:t xml:space="preserve">2,772, mas revela uma consequência da cauda do modelo agregado, não uma lei física estabelecida para o Sol.</w:t>
-      </w:r>
-    </w:p>
-    <w:p>
-      <w:pPr>
-        <w:pStyle w:val="BodyText"/>
-      </w:pPr>
-      <w:r>
-        <w:t xml:space="preserve">Os IC de 95% resumem a variação das estimativas nas</w:t>
-      </w:r>
-      <w:r>
-        <w:t xml:space="preserve"> </w:t>
-      </w:r>
-      <w:r>
-        <w:rPr>
-          <w:b/>
-          <w:bCs/>
-        </w:rPr>
-        <w:t xml:space="preserve">399 replicações válidas</w:t>
-      </w:r>
-      <w:r>
-        <w:t xml:space="preserve"> </w:t>
-      </w:r>
-      <w:r>
-        <w:t xml:space="preserve">do bootstrap, que reamostra segmentos de 5 meses. Se as hipóteses do modelo e da reamostragem fossem adequadas, cerca de 95% dos intervalos construídos em muitas repetições hipotéticas do estudo conteriam o nível de retorno populacional correspondente. Esse é o sentido frequentista de cobertura de 95%. Não se atribui uma probabilidade de 95% ao parâmetro fixo estar neste intervalo específico, nem se afirma que 95% dos fluxos observados estejam entre os limites. Nos horizontes longos há menos informação empírica sobre a região da cauda considerada, o que ajuda a compreender os intervalos mais amplos. Como o ajuste apresenta limitações, a cobertura aqui é nominal: o bootstrap preserva parte da dependência local, mas não corrige a má especificação ou toda a mudança temporal.</w:t>
-      </w:r>
-    </w:p>
-    <w:p>
-      <w:pPr>
-        <w:pStyle w:val="BodyText"/>
-      </w:pPr>
-      <w:r>
-        <w:t xml:space="preserve">Em termos do objeto estudado, os níveis representam intensidades extremas do fluxo de raios X registrado pelo canal XRS-B, calculadas a partir de médias de um minuto. Um fluxo maior indica maior intensidade registrada nesse canal, sem identificar automaticamente uma erupção física ou atribuir-lhe uma classe operacional. A comparação com a própria amostra evidencia a dificuldade do ajuste: o nível formal de 1 ano já equivale a</w:t>
-      </w:r>
-      <w:r>
-        <w:t xml:space="preserve"> </w:t>
-      </w:r>
-      <w:r>
-        <w:rPr>
-          <w:b/>
-          <w:bCs/>
-        </w:rPr>
-        <w:t xml:space="preserve">1,76 vezes o maior fluxo observado</w:t>
-      </w:r>
-      <w:r>
-        <w:t xml:space="preserve">. Ele teve 0 excedências, embora a GEV constante esperasse cerca de 7,8 entre os máximos elegíveis. Para 10 anos, a estimativa alcança cerca de 1.159,6 vezes o máximo observado. A distância não deve ser confundida com evidência de eventos solares dessa magnitude.</w:t>
-      </w:r>
-    </w:p>
-    <w:p>
-      <w:pPr>
-        <w:pStyle w:val="BodyText"/>
-      </w:pPr>
-      <w:r>
-        <w:t xml:space="preserve">Esses contrastes precisam ser lidos em conjunto com os diagnósticos anteriores: a</w:t>
-      </w:r>
-      <w:r>
-        <w:t xml:space="preserve"> </w:t>
-      </w:r>
-      <w:r>
-        <w:rPr>
-          <w:b/>
-          <w:bCs/>
-        </w:rPr>
-        <w:t xml:space="preserve">GEV estacionária global produz uma cauda superior excessivamente pesada em relação aos máximos observados</w:t>
-      </w:r>
-      <w:r>
-        <w:t xml:space="preserve">. Os níveis são úteis para explicitar as consequências matemáticas desse ajuste, mas seu crescimento e seus IC não validam a extrapolação. Os níveis de 5 e 10 anos também ultrapassam o limite valid_max declarado no produto (2,000e-01 W/m²), o que exige ressalva instrumental; esse limite não é uma barreira física demonstrada para o Sol. Assim, especialmente nos horizontes longos, a tabela apresenta</w:t>
-      </w:r>
-      <w:r>
-        <w:t xml:space="preserve"> </w:t>
-      </w:r>
-      <w:r>
-        <w:rPr>
-          <w:b/>
-          <w:bCs/>
-        </w:rPr>
-        <w:t xml:space="preserve">resultados formais e condicionais ao modelo, não previsões operacionais confiáveis da intensidade de eventos solares futuros</w:t>
-      </w:r>
-      <w:r>
-        <w:t xml:space="preserve">.</w:t>
-      </w:r>
-    </w:p>
-    <w:tbl>
-      <w:tblPr>
-        <w:tblStyle w:val="Table"/>
-        <w:tblW w:type="pct" w:w="5000"/>
-        <w:tblLayout w:type="fixed"/>
-        <w:tblLook w:firstRow="0" w:lastRow="0" w:firstColumn="0" w:lastColumn="0" w:noHBand="0" w:noVBand="0" w:val="0000"/>
-      </w:tblPr>
-      <w:tblGrid>
-        <w:gridCol w:w="7920"/>
-      </w:tblGrid>
-      <w:tr>
-        <w:tc>
-          <w:tcPr/>
-          <w:bookmarkStart w:id="81" w:name="fig-retornos"/>
-          <w:p>
-            <w:pPr>
-              <w:pStyle w:val="Compact"/>
-              <w:jc w:val="center"/>
-            </w:pPr>
-            <w:r>
-              <w:drawing>
-                <wp:inline>
-                  <wp:extent cx="5829300" cy="2975821"/>
-                  <wp:effectExtent b="0" l="0" r="0" t="0"/>
-                  <wp:docPr descr="" title="" id="79" name="Picture"/>
-                  <a:graphic>
-                    <a:graphicData uri="http://schemas.openxmlformats.org/drawingml/2006/picture">
-                      <pic:pic>
-                        <pic:nvPicPr>
-                          <pic:cNvPr descr="figuras/niveis_retorno.png" id="80" name="Picture"/>
-                          <pic:cNvPicPr>
-                            <a:picLocks noChangeArrowheads="1" noChangeAspect="1"/>
-                          </pic:cNvPicPr>
-                        </pic:nvPicPr>
-                        <pic:blipFill>
-                          <a:blip r:embed="rId78"/>
-                          <a:stretch>
-                            <a:fillRect/>
-                          </a:stretch>
-                        </pic:blipFill>
-                        <pic:spPr bwMode="auto">
-                          <a:xfrm>
-                            <a:off x="0" y="0"/>
-                            <a:ext cx="5829300" cy="2975821"/>
-                          </a:xfrm>
-                          <a:prstGeom prst="rect">
-                            <a:avLst/>
-                          </a:prstGeom>
-                          <a:noFill/>
-                          <a:ln w="9525">
-                            <a:noFill/>
-                            <a:headEnd/>
-                            <a:tailEnd/>
-                          </a:ln>
-                        </pic:spPr>
-                      </pic:pic>
-                    </a:graphicData>
-                  </a:graphic>
-                </wp:inline>
-              </w:drawing>
-            </w:r>
-          </w:p>
-          <w:p>
-            <w:pPr>
-              <w:jc w:val="center"/>
-            </w:pPr>
-            <w:pPr>
-              <w:jc w:val="start"/>
-              <w:spacing w:before="200"/>
-              <w:pStyle w:val="ImageCaption"/>
-            </w:pPr>
-            <w:r>
-              <w:t xml:space="preserve">Figura 10: Nível de retorno versus período em anos, com ambos os eixos em log10. Linha: estimativa; faixa: IC bootstrap de 95%; pontos: máximos com posições empíricas até dez anos. Resultados condicionais à GEV histórica, cuja cauda está mal calibrada.</w:t>
-            </w:r>
-          </w:p>
-          <w:bookmarkEnd w:id="81"/>
-        </w:tc>
-      </w:tr>
-    </w:tbl>
-    <w:p>
-      <w:pPr>
-        <w:pStyle w:val="BodyText"/>
-      </w:pPr>
-      <w:r>
-        <w:t xml:space="preserve">No gráfico, o eixo horizontal representa o período de retorno e o vertical, o fluxo. A linha corresponde aos quantis pontuais, a faixa aos IC bootstrap e os pontos aos máximos observados com posições empíricas. As escalas logarítmicas tornam visível o crescimento, mas não reduzem a distância entre as extrapolações e os dados. A curva e a tabela utilizam o mesmo ajuste e as mesmas replicações.</w:t>
-      </w:r>
-    </w:p>
-    <w:bookmarkEnd w:id="82"/>
-    <w:bookmarkStart w:id="88" w:name="Xb7c1256319cbb0e2f98c3b74fe90e9d50edd6ea"/>
-    <w:p>
-      <w:pPr>
-        <w:pStyle w:val="Heading2"/>
-      </w:pPr>
-      <w:r>
-        <w:t xml:space="preserve">4.7 Estacionariedade e comportamento temporal</w:t>
-      </w:r>
-    </w:p>
-    <w:p>
-      <w:pPr>
-        <w:pStyle w:val="FirstParagraph"/>
-      </w:pPr>
-      <w:r>
-        <w:t xml:space="preserve">Há dependência residual: a correlação de pares mensais adjacentes foi 0.795, em 91 pares. No PIT da GEV (probabilidade acumulada atribuída a cada máximo), o Ljung–Box no maior trecho contíguo apresentou valor p &lt; 0,001. Esses resultados e a variação anual desaconselham tratar os meses automaticamente como independentes e identicamente distribuídos. Recortes, autocorrelações e lags estão no</w:t>
-      </w:r>
-      <w:r>
-        <w:t xml:space="preserve"> </w:t>
-      </w:r>
-      <w:hyperlink w:anchor="ap-temporal">
-        <w:r>
-          <w:rPr>
-            <w:rStyle w:val="Hyperlink"/>
-          </w:rPr>
-          <w:t xml:space="preserve">Apêndice: dependência e comparação temporal</w:t>
-        </w:r>
-      </w:hyperlink>
-      <w:r>
-        <w:t xml:space="preserve">.</w:t>
-      </w:r>
-    </w:p>
-    <w:p>
-      <w:pPr>
-        <w:pStyle w:val="BodyText"/>
-      </w:pPr>
-      <w:r>
-        <w:t xml:space="preserve">A extensão linear acrescenta uma possível mudança na localização, mantendo escala e forma constantes. A</w:t>
-      </w:r>
-      <w:r>
-        <w:t xml:space="preserve"> </w:t>
-      </w:r>
-      <w:hyperlink w:anchor="tbl-nao-estacionaria">
-        <w:r>
-          <w:rPr>
-            <w:rStyle w:val="Hyperlink"/>
-          </w:rPr>
-          <w:t xml:space="preserve">Tabela 5</w:t>
-        </w:r>
-      </w:hyperlink>
-      <w:r>
-        <w:t xml:space="preserve"> </w:t>
-      </w:r>
-      <w:r>
-        <w:t xml:space="preserve">compara os mesmos máximos e apresenta os critérios na unidade original W/m².</w:t>
-      </w:r>
-    </w:p>
-    <w:tbl>
-      <w:tblPr>
-        <w:tblStyle w:val="Table"/>
-        <w:tblW w:type="pct" w:w="5000"/>
-        <w:tblLayout w:type="fixed"/>
-        <w:tblLook w:firstRow="0" w:lastRow="0" w:firstColumn="0" w:lastColumn="0" w:noHBand="0" w:noVBand="0" w:val="0000"/>
-      </w:tblPr>
-      <w:tblGrid>
-        <w:gridCol w:w="7920"/>
-      </w:tblGrid>
-      <w:tr>
-        <w:tc>
-          <w:tcPr/>
-          <w:bookmarkStart w:id="83" w:name="tbl-nao-estacionaria"/>
+          <w:bookmarkStart w:id="79" w:name="tbl-nao-estacionaria"/>
           <w:p>
             <w:pPr>
               <w:jc w:val="center"/>
@@ -4852,7 +4965,7 @@
               </w:tc>
             </w:tr>
           </w:tbl>
-          <w:bookmarkEnd w:id="83"/>
+          <w:bookmarkEnd w:id="79"/>
           <w:p/>
         </w:tc>
       </w:tr>
@@ -4878,7 +4991,7 @@
       <w:tr>
         <w:tc>
           <w:tcPr/>
-          <w:bookmarkStart w:id="87" w:name="fig-pit-tempo"/>
+          <w:bookmarkStart w:id="83" w:name="fig-pit-tempo"/>
           <w:p>
             <w:pPr>
               <w:pStyle w:val="Compact"/>
@@ -4889,18 +5002,18 @@
                 <wp:inline>
                   <wp:extent cx="5829300" cy="2975821"/>
                   <wp:effectExtent b="0" l="0" r="0" t="0"/>
-                  <wp:docPr descr="" title="" id="85" name="Picture"/>
+                  <wp:docPr descr="" title="" id="81" name="Picture"/>
                   <a:graphic>
                     <a:graphicData uri="http://schemas.openxmlformats.org/drawingml/2006/picture">
                       <pic:pic>
                         <pic:nvPicPr>
-                          <pic:cNvPr descr="figuras/pit_tempo.png" id="86" name="Picture"/>
+                          <pic:cNvPr descr="figuras/pit_tempo.png" id="82" name="Picture"/>
                           <pic:cNvPicPr>
                             <a:picLocks noChangeArrowheads="1" noChangeAspect="1"/>
                           </pic:cNvPicPr>
                         </pic:nvPicPr>
                         <pic:blipFill>
-                          <a:blip r:embed="rId84"/>
+                          <a:blip r:embed="rId80"/>
                           <a:stretch>
                             <a:fillRect/>
                           </a:stretch>
@@ -4937,10 +5050,10 @@
               <w:pStyle w:val="ImageCaption"/>
             </w:pPr>
             <w:r>
-              <w:t xml:space="preserve">Figura 11: Probabilidades acumuladas no tempo: GEV estacionária (pontos) e localização linear (linha). Uma transformação bem calibrada não deveria apresentar padrões temporais persistentes.</w:t>
+              <w:t xml:space="preserve">Figura 10: Probabilidades acumuladas no tempo: GEV estacionária (pontos) e localização linear (linha). Uma transformação bem calibrada não deveria apresentar padrões temporais persistentes.</w:t>
             </w:r>
           </w:p>
-          <w:bookmarkEnd w:id="87"/>
+          <w:bookmarkEnd w:id="83"/>
         </w:tc>
       </w:tr>
     </w:tbl>
@@ -4952,8 +5065,8 @@
         <w:t xml:space="preserve">A extensão não elimina o padrão temporal observado. Uma reta na localização é uma aproximação restritiva diante das diferenças entre anos e não representa necessariamente a dinâmica da atividade solar. O teste nominal também pressupõe regularidade e independência aproximadas; com dependência residual, sua interpretação é exploratória.</w:t>
       </w:r>
     </w:p>
-    <w:bookmarkEnd w:id="88"/>
-    <w:bookmarkStart w:id="89" w:name="síntese-dos-principais-resultados"/>
+    <w:bookmarkEnd w:id="84"/>
+    <w:bookmarkStart w:id="85" w:name="síntese-dos-principais-resultados"/>
     <w:p>
       <w:pPr>
         <w:pStyle w:val="Heading2"/>
@@ -4978,9 +5091,9 @@
         <w:t xml:space="preserve">A GEV convergiu e permitiu calcular quantis e intervalos. Contudo, o QQ, a forma elevada e a falta de excedências dos níveis formais revelaram má calibração na cauda superior. A extensão linear não solucionou essa limitação. A análise caracteriza os extremos observados, sem validar previsões de futuras erupções solares.</w:t>
       </w:r>
     </w:p>
-    <w:bookmarkEnd w:id="89"/>
-    <w:bookmarkEnd w:id="90"/>
-    <w:bookmarkStart w:id="91" w:name="discussão"/>
+    <w:bookmarkEnd w:id="85"/>
+    <w:bookmarkEnd w:id="86"/>
+    <w:bookmarkStart w:id="87" w:name="discussão"/>
     <w:p>
       <w:pPr>
         <w:pStyle w:val="Heading1"/>
@@ -5031,8 +5144,8 @@
         <w:t xml:space="preserve">Uma série mais longa e covariáveis externas poderiam apoiar investigações posteriores. Isso não permite atribuir mecanismos físicos aos padrões atuais: o estudo caracteriza o fluxo disponível e não identifica individualmente flares nem estabelece relações causais com a atividade solar.</w:t>
       </w:r>
     </w:p>
-    <w:bookmarkEnd w:id="91"/>
-    <w:bookmarkStart w:id="92" w:name="conclusão"/>
+    <w:bookmarkEnd w:id="87"/>
+    <w:bookmarkStart w:id="88" w:name="conclusão"/>
     <w:p>
       <w:pPr>
         <w:pStyle w:val="Heading1"/>
@@ -5099,8 +5212,8 @@
         <w:t xml:space="preserve">. Os níveis de retorno e seus intervalos são condicionais aos modelos e devem ser interpretados com cautela, sem apresentá-los como previsões de futuras erupções solares.</w:t>
       </w:r>
     </w:p>
-    <w:bookmarkEnd w:id="92"/>
-    <w:bookmarkStart w:id="93" w:name="referências"/>
+    <w:bookmarkEnd w:id="88"/>
+    <w:bookmarkStart w:id="89" w:name="referências"/>
     <w:p>
       <w:pPr>
         <w:pStyle w:val="Heading1"/>
@@ -5247,8 +5360,8 @@
         <w:t xml:space="preserve">.</w:t>
       </w:r>
     </w:p>
-    <w:bookmarkEnd w:id="93"/>
-    <w:bookmarkStart w:id="120" w:name="apêndice-informações-complementares"/>
+    <w:bookmarkEnd w:id="89"/>
+    <w:bookmarkStart w:id="116" w:name="apêndice-informações-complementares"/>
     <w:p>
       <w:pPr>
         <w:pStyle w:val="Heading1"/>
@@ -5277,7 +5390,7 @@
         <w:t xml:space="preserve">, inclusive quando apenas um resumo é apresentado aqui. Nenhuma análise ou observação foi removida do fluxo de cálculo para simplificar a exposição.</w:t>
       </w:r>
     </w:p>
-    <w:bookmarkStart w:id="97" w:name="ap-controle"/>
+    <w:bookmarkStart w:id="93" w:name="ap-controle"/>
     <w:p>
       <w:pPr>
         <w:pStyle w:val="Heading2"/>
@@ -5346,7 +5459,7 @@
       <w:tr>
         <w:tc>
           <w:tcPr/>
-          <w:bookmarkStart w:id="94" w:name="tbl-flags"/>
+          <w:bookmarkStart w:id="90" w:name="tbl-flags"/>
           <w:p>
             <w:pPr>
               <w:jc w:val="center"/>
@@ -5711,7 +5824,7 @@
               </w:tc>
             </w:tr>
           </w:tbl>
-          <w:bookmarkEnd w:id="94"/>
+          <w:bookmarkEnd w:id="90"/>
           <w:p/>
         </w:tc>
       </w:tr>
@@ -5752,7 +5865,7 @@
       <w:tr>
         <w:tc>
           <w:tcPr/>
-          <w:bookmarkStart w:id="95" w:name="tbl-qc"/>
+          <w:bookmarkStart w:id="91" w:name="tbl-qc"/>
           <w:p>
             <w:pPr>
               <w:jc w:val="center"/>
@@ -5875,7 +5988,7 @@
               </w:tc>
             </w:tr>
           </w:tbl>
-          <w:bookmarkEnd w:id="95"/>
+          <w:bookmarkEnd w:id="91"/>
           <w:p/>
         </w:tc>
       </w:tr>
@@ -5901,7 +6014,7 @@
       <w:tr>
         <w:tc>
           <w:tcPr/>
-          <w:bookmarkStart w:id="96" w:name="tbl-cobertura"/>
+          <w:bookmarkStart w:id="92" w:name="tbl-cobertura"/>
           <w:p>
             <w:pPr>
               <w:jc w:val="center"/>
@@ -6482,7 +6595,7 @@
               </w:tc>
             </w:tr>
           </w:tbl>
-          <w:bookmarkEnd w:id="96"/>
+          <w:bookmarkEnd w:id="92"/>
           <w:p/>
         </w:tc>
       </w:tr>
@@ -6515,8 +6628,8 @@
         <w:t xml:space="preserve">A leitura registrou avisos de conversão de atributos inteiros de 8 bytes para double (algorithm_version e input_files_total). Os valores lidos são pequenos e exatamente representáveis; tempo, fluxo e flags não foram alterados. Os avisos estão em tabelas/avisos_metadados.csv.</w:t>
       </w:r>
     </w:p>
-    <w:bookmarkEnd w:id="97"/>
-    <w:bookmarkStart w:id="105" w:name="ap-temporal"/>
+    <w:bookmarkEnd w:id="93"/>
+    <w:bookmarkStart w:id="101" w:name="ap-temporal"/>
     <w:p>
       <w:pPr>
         <w:pStyle w:val="Heading2"/>
@@ -6546,7 +6659,7 @@
       <w:tr>
         <w:tc>
           <w:tcPr/>
-          <w:bookmarkStart w:id="98" w:name="tbl-trechos"/>
+          <w:bookmarkStart w:id="94" w:name="tbl-trechos"/>
           <w:p>
             <w:pPr>
               <w:jc w:val="center"/>
@@ -6989,7 +7102,7 @@
               </w:tc>
             </w:tr>
           </w:tbl>
-          <w:bookmarkEnd w:id="98"/>
+          <w:bookmarkEnd w:id="94"/>
           <w:p/>
         </w:tc>
       </w:tr>
@@ -7015,7 +7128,7 @@
       <w:tr>
         <w:tc>
           <w:tcPr/>
-          <w:bookmarkStart w:id="99" w:name="tbl-ljung"/>
+          <w:bookmarkStart w:id="95" w:name="tbl-ljung"/>
           <w:p>
             <w:pPr>
               <w:jc w:val="center"/>
@@ -7458,7 +7571,7 @@
               </w:tc>
             </w:tr>
           </w:tbl>
-          <w:bookmarkEnd w:id="99"/>
+          <w:bookmarkEnd w:id="95"/>
           <w:p/>
         </w:tc>
       </w:tr>
@@ -7484,7 +7597,7 @@
       <w:tr>
         <w:tc>
           <w:tcPr/>
-          <w:bookmarkStart w:id="103" w:name="fig-dependencia-mensal"/>
+          <w:bookmarkStart w:id="99" w:name="fig-dependencia-mensal"/>
           <w:p>
             <w:pPr>
               <w:pStyle w:val="Compact"/>
@@ -7495,18 +7608,18 @@
                 <wp:inline>
                   <wp:extent cx="5829300" cy="2975821"/>
                   <wp:effectExtent b="0" l="0" r="0" t="0"/>
-                  <wp:docPr descr="" title="" id="101" name="Picture"/>
+                  <wp:docPr descr="" title="" id="97" name="Picture"/>
                   <a:graphic>
                     <a:graphicData uri="http://schemas.openxmlformats.org/drawingml/2006/picture">
                       <pic:pic>
                         <pic:nvPicPr>
-                          <pic:cNvPr descr="figuras/dependencia_maximos_mensal.png" id="102" name="Picture"/>
+                          <pic:cNvPr descr="figuras/dependencia_maximos_mensal.png" id="98" name="Picture"/>
                           <pic:cNvPicPr>
                             <a:picLocks noChangeArrowheads="1" noChangeAspect="1"/>
                           </pic:cNvPicPr>
                         </pic:nvPicPr>
                         <pic:blipFill>
-                          <a:blip r:embed="rId100"/>
+                          <a:blip r:embed="rId96"/>
                           <a:stretch>
                             <a:fillRect/>
                           </a:stretch>
@@ -7543,10 +7656,10 @@
               <w:pStyle w:val="ImageCaption"/>
             </w:pPr>
             <w:r>
-              <w:t xml:space="preserve">Figura 12: ACF e PACF de log10 dos máximos mensais no maior trecho contíguo. Bandas pontuais aproximadas sob ruído branco.</w:t>
+              <w:t xml:space="preserve">Figura 11: ACF e PACF de log10 dos máximos mensais no maior trecho contíguo. Bandas pontuais aproximadas sob ruído branco.</w:t>
             </w:r>
           </w:p>
-          <w:bookmarkEnd w:id="103"/>
+          <w:bookmarkEnd w:id="99"/>
         </w:tc>
       </w:tr>
     </w:tbl>
@@ -7600,7 +7713,7 @@
       <w:tr>
         <w:tc>
           <w:tcPr/>
-          <w:bookmarkStart w:id="104" w:name="tbl-parametros-ns"/>
+          <w:bookmarkStart w:id="100" w:name="tbl-parametros-ns"/>
           <w:p>
             <w:pPr>
               <w:jc w:val="center"/>
@@ -8043,7 +8156,7 @@
               </w:tc>
             </w:tr>
           </w:tbl>
-          <w:bookmarkEnd w:id="104"/>
+          <w:bookmarkEnd w:id="100"/>
           <w:p/>
         </w:tc>
       </w:tr>
@@ -8071,8 +8184,8 @@
         <w:t xml:space="preserve">mantém a escala numérica original. A diferença de AIC é preservada.</w:t>
       </w:r>
     </w:p>
-    <w:bookmarkEnd w:id="105"/>
-    <w:bookmarkStart w:id="109" w:name="incerteza-da-gev-e-calibração"/>
+    <w:bookmarkEnd w:id="101"/>
+    <w:bookmarkStart w:id="105" w:name="incerteza-da-gev-e-calibração"/>
     <w:p>
       <w:pPr>
         <w:pStyle w:val="Heading2"/>
@@ -8094,7 +8207,7 @@
       <w:tr>
         <w:tc>
           <w:tcPr/>
-          <w:bookmarkStart w:id="106" w:name="tbl-parametros-wald"/>
+          <w:bookmarkStart w:id="102" w:name="tbl-parametros-wald"/>
           <w:p>
             <w:pPr>
               <w:jc w:val="center"/>
@@ -8404,7 +8517,7 @@
               </w:tc>
             </w:tr>
           </w:tbl>
-          <w:bookmarkEnd w:id="106"/>
+          <w:bookmarkEnd w:id="102"/>
           <w:p/>
         </w:tc>
       </w:tr>
@@ -8443,7 +8556,7 @@
       <w:tr>
         <w:tc>
           <w:tcPr/>
-          <w:bookmarkStart w:id="107" w:name="tbl-calibracao-retornos"/>
+          <w:bookmarkStart w:id="103" w:name="tbl-calibracao-retornos"/>
           <w:p>
             <w:pPr>
               <w:jc w:val="center"/>
@@ -8688,7 +8801,7 @@
               </w:tc>
             </w:tr>
           </w:tbl>
-          <w:bookmarkEnd w:id="107"/>
+          <w:bookmarkEnd w:id="103"/>
           <w:p/>
         </w:tc>
       </w:tr>
@@ -8714,7 +8827,7 @@
       <w:tr>
         <w:tc>
           <w:tcPr/>
-          <w:bookmarkStart w:id="108" w:name="tbl-condicionais"/>
+          <w:bookmarkStart w:id="104" w:name="tbl-condicionais"/>
           <w:p>
             <w:pPr>
               <w:jc w:val="center"/>
@@ -9091,7 +9204,7 @@
               </w:tc>
             </w:tr>
           </w:tbl>
-          <w:bookmarkEnd w:id="108"/>
+          <w:bookmarkEnd w:id="104"/>
           <w:p/>
         </w:tc>
       </w:tr>
@@ -9104,8 +9217,8 @@
         <w:t xml:space="preserve">Esses quantis mantêm a covariável na data de referência; não representam uma trajetória futura de atividade solar. Seus intervalos delta não são a faixa bootstrap histórica e não incorporam dependência ou incerteza dessa trajetória.</w:t>
       </w:r>
     </w:p>
-    <w:bookmarkEnd w:id="109"/>
-    <w:bookmarkStart w:id="111" w:name="ap-sensibilidade"/>
+    <w:bookmarkEnd w:id="105"/>
+    <w:bookmarkStart w:id="107" w:name="ap-sensibilidade"/>
     <w:p>
       <w:pPr>
         <w:pStyle w:val="Heading2"/>
@@ -9135,7 +9248,7 @@
       <w:tr>
         <w:tc>
           <w:tcPr/>
-          <w:bookmarkStart w:id="110" w:name="tbl-sensibilidade-gev"/>
+          <w:bookmarkStart w:id="106" w:name="tbl-sensibilidade-gev"/>
           <w:p>
             <w:pPr>
               <w:jc w:val="center"/>
@@ -9658,7 +9771,7 @@
               </w:tc>
             </w:tr>
           </w:tbl>
-          <w:bookmarkEnd w:id="110"/>
+          <w:bookmarkEnd w:id="106"/>
           <w:p/>
         </w:tc>
       </w:tr>
@@ -9698,8 +9811,8 @@
         <w:t xml:space="preserve">.</w:t>
       </w:r>
     </w:p>
-    <w:bookmarkEnd w:id="111"/>
-    <w:bookmarkStart w:id="119" w:name="ap-reproducao"/>
+    <w:bookmarkEnd w:id="107"/>
+    <w:bookmarkStart w:id="115" w:name="ap-reproducao"/>
     <w:p>
       <w:pPr>
         <w:pStyle w:val="Heading2"/>
@@ -9835,7 +9948,7 @@
       <w:r>
         <w:t xml:space="preserve"> </w:t>
       </w:r>
-      <w:hyperlink r:id="rId112">
+      <w:hyperlink r:id="rId108">
         <w:r>
           <w:rPr>
             <w:rStyle w:val="Hyperlink"/>
@@ -9849,7 +9962,7 @@
       <w:r>
         <w:t xml:space="preserve"> </w:t>
       </w:r>
-      <w:hyperlink r:id="rId113">
+      <w:hyperlink r:id="rId109">
         <w:r>
           <w:rPr>
             <w:rStyle w:val="Hyperlink"/>
@@ -9917,7 +10030,7 @@
       <w:r>
         <w:t xml:space="preserve"> </w:t>
       </w:r>
-      <w:hyperlink r:id="rId114">
+      <w:hyperlink r:id="rId110">
         <w:r>
           <w:rPr>
             <w:rStyle w:val="Hyperlink"/>
@@ -9937,7 +10050,7 @@
       <w:r>
         <w:t xml:space="preserve"> </w:t>
       </w:r>
-      <w:hyperlink r:id="rId115">
+      <w:hyperlink r:id="rId111">
         <w:r>
           <w:rPr>
             <w:rStyle w:val="Hyperlink"/>
@@ -9990,7 +10103,7 @@
       <w:r>
         <w:t xml:space="preserve"> </w:t>
       </w:r>
-      <w:hyperlink r:id="rId116">
+      <w:hyperlink r:id="rId112">
         <w:r>
           <w:rPr>
             <w:rStyle w:val="Hyperlink"/>
@@ -10056,7 +10169,7 @@
       <w:r>
         <w:t xml:space="preserve"> </w:t>
       </w:r>
-      <w:hyperlink r:id="rId117">
+      <w:hyperlink r:id="rId113">
         <w:r>
           <w:rPr>
             <w:rStyle w:val="Hyperlink"/>
@@ -10117,7 +10230,7 @@
       <w:r>
         <w:t xml:space="preserve"> </w:t>
       </w:r>
-      <w:hyperlink r:id="rId118">
+      <w:hyperlink r:id="rId114">
         <w:r>
           <w:rPr>
             <w:rStyle w:val="Hyperlink"/>
@@ -10156,7 +10269,7 @@
       <w:r>
         <w:t xml:space="preserve"> </w:t>
       </w:r>
-      <w:hyperlink r:id="rId118">
+      <w:hyperlink r:id="rId114">
         <w:r>
           <w:rPr>
             <w:rStyle w:val="Hyperlink"/>
@@ -10482,8 +10595,8 @@
         <w:t xml:space="preserve">[33] tools_4.5.0       gtable_0.3.6     </w:t>
       </w:r>
     </w:p>
-    <w:bookmarkEnd w:id="119"/>
-    <w:bookmarkEnd w:id="120"/>
+    <w:bookmarkEnd w:id="115"/>
+    <w:bookmarkEnd w:id="116"/>
     <w:sectPr>
       <w:footerReference r:id="rId9" w:type="default"/>
       <w:footnotePr>

</xml_diff>